<commit_message>
paper: multi-seed USAD/TranAD + GDN(SWaT) folded into Table 3 (item 8b/11)
Modal matrix: USAD & TranAD re-run 5 seeds x 3 datasets under the raw protocol; GDN
re-run under the identical protocol but its per-window graph training completed within
budget only on SWaT (WADI 123-ch / HAI graph did not finish before the 110-min watchdog).

Table 3 USAD/TranAD now report AUROC mean+-std over 5 seeds (values essentially unchanged
-> the collapse is robust: WADI 0.305/0.325, HAI 0.477/0.444, SWaT 0.867/0.867 difficult).
GDN added to the SWaT block (0.871 difficult, ties the deep detectors, below ours).
Caption, Sec 2.3, Sec 5.5, and the Sec 6 collapse numbers updated; DOCX rebuilt + QA'd.

GDN's WADI/HAI runs did not complete, so the WADI comparison still rests on Isolation
Forest; stated plainly rather than hidden.

Co-Authored-By: Claude Opus 4.8 <noreply@anthropic.com>
</commit_message>
<xml_diff>
--- a/paper_mdpi.docx
+++ b/paper_mdpi.docx
@@ -1237,13 +1237,19 @@
         <w:t xml:space="preserve"> </w:t>
       </w:r>
       <w:r>
-        <w:t xml:space="preserve">raw, difficulty-stratified metrics (the re-scored comparison is in §6), and leave a raw-metric evaluation of</w:t>
-      </w:r>
-      <w:r>
-        <w:t xml:space="preserve"> </w:t>
-      </w:r>
-      <w:r>
-        <w:t xml:space="preserve">these newer detectors and of the cross-channel GDN, whose published evaluation uses point adjustment, to future</w:t>
+        <w:t xml:space="preserve">raw, difficulty-stratified metrics over five seeds (the re-scored comparison is in §6), and additionally</w:t>
+      </w:r>
+      <w:r>
+        <w:t xml:space="preserve"> </w:t>
+      </w:r>
+      <w:r>
+        <w:t xml:space="preserve">re-run the cross-channel GDN under the identical raw protocol where its per-window graph training was tractable</w:t>
+      </w:r>
+      <w:r>
+        <w:t xml:space="preserve"> </w:t>
+      </w:r>
+      <w:r>
+        <w:t xml:space="preserve">(SWaT). A raw-metric evaluation of the newer reconstruction detectors (SensitiveHUE, CATCH) is left to future</w:t>
       </w:r>
       <w:r>
         <w:t xml:space="preserve"> </w:t>
@@ -6666,7 +6672,7 @@
         </w:r>
       </w:hyperlink>
       <w:r>
-        <w:t xml:space="preserve">] through the TranAD evaluation harness and score them with the</w:t>
+        <w:t xml:space="preserve">] through the TranAD evaluation harness over five seeds and score them with the</w:t>
       </w:r>
       <w:r>
         <w:t xml:space="preserve"> </w:t>
@@ -6676,30 +6682,39 @@
           <w:i/>
           <w:iCs/>
         </w:rPr>
-        <w:t xml:space="preserve">same raw point-wise</w:t>
-      </w:r>
-      <w:r>
-        <w:rPr>
-          <w:i/>
-          <w:iCs/>
-        </w:rPr>
-        <w:t xml:space="preserve"> </w:t>
-      </w:r>
-      <w:r>
-        <w:rPr>
-          <w:i/>
-          <w:iCs/>
-        </w:rPr>
-        <w:t xml:space="preserve">metrics</w:t>
-      </w:r>
-      <w:r>
-        <w:t xml:space="preserve">, aggregating their per-timestep scores onto our window grid (with an integer-ratio correction for</w:t>
-      </w:r>
-      <w:r>
-        <w:t xml:space="preserve"> </w:t>
-      </w:r>
-      <w:r>
-        <w:t xml:space="preserve">HAI's downsampling).</w:t>
+        <w:t xml:space="preserve">same raw point-wise metrics</w:t>
+      </w:r>
+      <w:r>
+        <w:t xml:space="preserve">, aggregating their per-timestep scores onto our window grid (with an</w:t>
+      </w:r>
+      <w:r>
+        <w:t xml:space="preserve"> </w:t>
+      </w:r>
+      <w:r>
+        <w:t xml:space="preserve">integer-ratio correction for HAI's downsampling). We also re-run the graph-based GDN [</w:t>
+      </w:r>
+      <w:hyperlink w:anchor="r-gdn">
+        <w:r>
+          <w:rPr>
+            <w:rStyle w:val="Hyperlink"/>
+          </w:rPr>
+          <w:t xml:space="preserve">24</w:t>
+        </w:r>
+      </w:hyperlink>
+      <w:r>
+        <w:t xml:space="preserve">]</w:t>
+      </w:r>
+      <w:r>
+        <w:t xml:space="preserve"> </w:t>
+      </w:r>
+      <w:r>
+        <w:t xml:space="preserve">under the identical protocol; its per-window graph training completed within our compute budget only on SWaT,</w:t>
+      </w:r>
+      <w:r>
+        <w:t xml:space="preserve"> </w:t>
+      </w:r>
+      <w:r>
+        <w:t xml:space="preserve">where it matches the other deep detectors (difficult-subset AUROC 0.871, below ours).</w:t>
       </w:r>
       <w:r>
         <w:t xml:space="preserve"> </w:t>
@@ -6841,19 +6856,25 @@
         <w:t xml:space="preserve"> </w:t>
       </w:r>
       <w:r>
-        <w:t xml:space="preserve">detectors (Isolation Forest, AutoEncoder, and the VaDE family) report AUROC as mean±standard deviation</w:t>
-      </w:r>
-      <w:r>
-        <w:t xml:space="preserve"> </w:t>
-      </w:r>
-      <w:r>
-        <w:t xml:space="preserve">over five seeds. Bold = best AUROC in that dataset×subset column (ties bolded jointly). “Ours”</w:t>
-      </w:r>
-      <w:r>
-        <w:t xml:space="preserve"> </w:t>
-      </w:r>
-      <w:r>
-        <w:t xml:space="preserve">= the VaDE-hard+resid(auto) headline model. The</w:t>
+        <w:t xml:space="preserve">detectors (Isolation Forest, AutoEncoder, USAD, TranAD, and the VaDE family) report AUROC as</w:t>
+      </w:r>
+      <w:r>
+        <w:t xml:space="preserve"> </w:t>
+      </w:r>
+      <w:r>
+        <w:t xml:space="preserve">mean±standard deviation over five seeds; GDN, whose per-window graph training completed only on SWaT within</w:t>
+      </w:r>
+      <w:r>
+        <w:t xml:space="preserve"> </w:t>
+      </w:r>
+      <w:r>
+        <w:t xml:space="preserve">our compute budget, is reported single-run on SWaT. Bold = best AUROC in that dataset×subset column (ties</w:t>
+      </w:r>
+      <w:r>
+        <w:t xml:space="preserve"> </w:t>
+      </w:r>
+      <w:r>
+        <w:t xml:space="preserve">bolded jointly). “Ours” = the VaDE-hard+resid(auto) headline model. The</w:t>
       </w:r>
       <w:r>
         <w:t xml:space="preserve"> </w:t>
@@ -7929,102 +7950,102 @@
                 <w:sz w:val="18"/>
                 <w:szCs w:val="18"/>
               </w:rPr>
-              <w:t xml:space="preserve">0.698</w:t>
-            </w:r>
-          </w:p>
-        </w:tc>
-        <w:tc>
-          <w:tcPr>
-            <w:vAlign w:val="center"/>
-          </w:tcPr>
-          <w:p>
-            <w:pPr>
-              <w:pStyle w:val="Compact"/>
-              <w:suppressAutoHyphens/>
-              <w:jc w:val="center"/>
-            </w:pPr>
-            <w:r>
-              <w:rPr>
-                <w:sz w:val="18"/>
-                <w:szCs w:val="18"/>
-              </w:rPr>
-              <w:t xml:space="preserve">0.516</w:t>
-            </w:r>
-          </w:p>
-        </w:tc>
-        <w:tc>
-          <w:tcPr>
-            <w:vAlign w:val="center"/>
-          </w:tcPr>
-          <w:p>
-            <w:pPr>
-              <w:pStyle w:val="Compact"/>
-              <w:suppressAutoHyphens/>
-              <w:jc w:val="center"/>
-            </w:pPr>
-            <w:r>
-              <w:rPr>
-                <w:sz w:val="18"/>
-                <w:szCs w:val="18"/>
-              </w:rPr>
-              <w:t xml:space="preserve">0.901</w:t>
-            </w:r>
-          </w:p>
-        </w:tc>
-        <w:tc>
-          <w:tcPr>
-            <w:vAlign w:val="center"/>
-          </w:tcPr>
-          <w:p>
-            <w:pPr>
-              <w:pStyle w:val="Compact"/>
-              <w:suppressAutoHyphens/>
-              <w:jc w:val="center"/>
-            </w:pPr>
-            <w:r>
-              <w:rPr>
-                <w:sz w:val="18"/>
-                <w:szCs w:val="18"/>
-              </w:rPr>
-              <w:t xml:space="preserve">0.658</w:t>
-            </w:r>
-          </w:p>
-        </w:tc>
-        <w:tc>
-          <w:tcPr>
-            <w:vAlign w:val="center"/>
-          </w:tcPr>
-          <w:p>
-            <w:pPr>
-              <w:pStyle w:val="Compact"/>
-              <w:suppressAutoHyphens/>
-              <w:jc w:val="center"/>
-            </w:pPr>
-            <w:r>
-              <w:rPr>
-                <w:sz w:val="18"/>
-                <w:szCs w:val="18"/>
-              </w:rPr>
-              <w:t xml:space="preserve">0.303</w:t>
-            </w:r>
-          </w:p>
-        </w:tc>
-        <w:tc>
-          <w:tcPr>
-            <w:vAlign w:val="center"/>
-          </w:tcPr>
-          <w:p>
-            <w:pPr>
-              <w:pStyle w:val="Compact"/>
-              <w:suppressAutoHyphens/>
-              <w:jc w:val="center"/>
-            </w:pPr>
-            <w:r>
-              <w:rPr>
-                <w:sz w:val="18"/>
-                <w:szCs w:val="18"/>
-              </w:rPr>
-              <w:t xml:space="preserve">0.033</w:t>
+              <w:t xml:space="preserve">0.700±0.001</w:t>
+            </w:r>
+          </w:p>
+        </w:tc>
+        <w:tc>
+          <w:tcPr>
+            <w:vAlign w:val="center"/>
+          </w:tcPr>
+          <w:p>
+            <w:pPr>
+              <w:pStyle w:val="Compact"/>
+              <w:suppressAutoHyphens/>
+              <w:jc w:val="center"/>
+            </w:pPr>
+            <w:r>
+              <w:rPr>
+                <w:sz w:val="18"/>
+                <w:szCs w:val="18"/>
+              </w:rPr>
+              <w:t xml:space="preserve">0.512</w:t>
+            </w:r>
+          </w:p>
+        </w:tc>
+        <w:tc>
+          <w:tcPr>
+            <w:vAlign w:val="center"/>
+          </w:tcPr>
+          <w:p>
+            <w:pPr>
+              <w:pStyle w:val="Compact"/>
+              <w:suppressAutoHyphens/>
+              <w:jc w:val="center"/>
+            </w:pPr>
+            <w:r>
+              <w:rPr>
+                <w:sz w:val="18"/>
+                <w:szCs w:val="18"/>
+              </w:rPr>
+              <w:t xml:space="preserve">0.903±0.002</w:t>
+            </w:r>
+          </w:p>
+        </w:tc>
+        <w:tc>
+          <w:tcPr>
+            <w:vAlign w:val="center"/>
+          </w:tcPr>
+          <w:p>
+            <w:pPr>
+              <w:pStyle w:val="Compact"/>
+              <w:suppressAutoHyphens/>
+              <w:jc w:val="center"/>
+            </w:pPr>
+            <w:r>
+              <w:rPr>
+                <w:sz w:val="18"/>
+                <w:szCs w:val="18"/>
+              </w:rPr>
+              <w:t xml:space="preserve">0.655</w:t>
+            </w:r>
+          </w:p>
+        </w:tc>
+        <w:tc>
+          <w:tcPr>
+            <w:vAlign w:val="center"/>
+          </w:tcPr>
+          <w:p>
+            <w:pPr>
+              <w:pStyle w:val="Compact"/>
+              <w:suppressAutoHyphens/>
+              <w:jc w:val="center"/>
+            </w:pPr>
+            <w:r>
+              <w:rPr>
+                <w:sz w:val="18"/>
+                <w:szCs w:val="18"/>
+              </w:rPr>
+              <w:t xml:space="preserve">0.305±0.004</w:t>
+            </w:r>
+          </w:p>
+        </w:tc>
+        <w:tc>
+          <w:tcPr>
+            <w:vAlign w:val="center"/>
+          </w:tcPr>
+          <w:p>
+            <w:pPr>
+              <w:pStyle w:val="Compact"/>
+              <w:suppressAutoHyphens/>
+              <w:jc w:val="center"/>
+            </w:pPr>
+            <w:r>
+              <w:rPr>
+                <w:sz w:val="18"/>
+                <w:szCs w:val="18"/>
+              </w:rPr>
+              <w:t xml:space="preserve">0.030</w:t>
             </w:r>
           </w:p>
         </w:tc>
@@ -8083,102 +8104,102 @@
                 <w:sz w:val="18"/>
                 <w:szCs w:val="18"/>
               </w:rPr>
-              <w:t xml:space="preserve">0.721</w:t>
-            </w:r>
-          </w:p>
-        </w:tc>
-        <w:tc>
-          <w:tcPr>
-            <w:vAlign w:val="center"/>
-          </w:tcPr>
-          <w:p>
-            <w:pPr>
-              <w:pStyle w:val="Compact"/>
-              <w:suppressAutoHyphens/>
-              <w:jc w:val="center"/>
-            </w:pPr>
-            <w:r>
-              <w:rPr>
-                <w:sz w:val="18"/>
-                <w:szCs w:val="18"/>
-              </w:rPr>
-              <w:t xml:space="preserve">0.556</w:t>
-            </w:r>
-          </w:p>
-        </w:tc>
-        <w:tc>
-          <w:tcPr>
-            <w:vAlign w:val="center"/>
-          </w:tcPr>
-          <w:p>
-            <w:pPr>
-              <w:pStyle w:val="Compact"/>
-              <w:suppressAutoHyphens/>
-              <w:jc w:val="center"/>
-            </w:pPr>
-            <w:r>
-              <w:rPr>
-                <w:sz w:val="18"/>
-                <w:szCs w:val="18"/>
-              </w:rPr>
-              <w:t xml:space="preserve">0.921</w:t>
-            </w:r>
-          </w:p>
-        </w:tc>
-        <w:tc>
-          <w:tcPr>
-            <w:vAlign w:val="center"/>
-          </w:tcPr>
-          <w:p>
-            <w:pPr>
-              <w:pStyle w:val="Compact"/>
-              <w:suppressAutoHyphens/>
-              <w:jc w:val="center"/>
-            </w:pPr>
-            <w:r>
-              <w:rPr>
-                <w:sz w:val="18"/>
-                <w:szCs w:val="18"/>
-              </w:rPr>
-              <w:t xml:space="preserve">0.686</w:t>
-            </w:r>
-          </w:p>
-        </w:tc>
-        <w:tc>
-          <w:tcPr>
-            <w:vAlign w:val="center"/>
-          </w:tcPr>
-          <w:p>
-            <w:pPr>
-              <w:pStyle w:val="Compact"/>
-              <w:suppressAutoHyphens/>
-              <w:jc w:val="center"/>
-            </w:pPr>
-            <w:r>
-              <w:rPr>
-                <w:sz w:val="18"/>
-                <w:szCs w:val="18"/>
-              </w:rPr>
-              <w:t xml:space="preserve">0.333</w:t>
-            </w:r>
-          </w:p>
-        </w:tc>
-        <w:tc>
-          <w:tcPr>
-            <w:vAlign w:val="center"/>
-          </w:tcPr>
-          <w:p>
-            <w:pPr>
-              <w:pStyle w:val="Compact"/>
-              <w:suppressAutoHyphens/>
-              <w:jc w:val="center"/>
-            </w:pPr>
-            <w:r>
-              <w:rPr>
-                <w:sz w:val="18"/>
-                <w:szCs w:val="18"/>
-              </w:rPr>
-              <w:t xml:space="preserve">0.039</w:t>
+              <w:t xml:space="preserve">0.717±0.003</w:t>
+            </w:r>
+          </w:p>
+        </w:tc>
+        <w:tc>
+          <w:tcPr>
+            <w:vAlign w:val="center"/>
+          </w:tcPr>
+          <w:p>
+            <w:pPr>
+              <w:pStyle w:val="Compact"/>
+              <w:suppressAutoHyphens/>
+              <w:jc w:val="center"/>
+            </w:pPr>
+            <w:r>
+              <w:rPr>
+                <w:sz w:val="18"/>
+                <w:szCs w:val="18"/>
+              </w:rPr>
+              <w:t xml:space="preserve">0.571</w:t>
+            </w:r>
+          </w:p>
+        </w:tc>
+        <w:tc>
+          <w:tcPr>
+            <w:vAlign w:val="center"/>
+          </w:tcPr>
+          <w:p>
+            <w:pPr>
+              <w:pStyle w:val="Compact"/>
+              <w:suppressAutoHyphens/>
+              <w:jc w:val="center"/>
+            </w:pPr>
+            <w:r>
+              <w:rPr>
+                <w:sz w:val="18"/>
+                <w:szCs w:val="18"/>
+              </w:rPr>
+              <w:t xml:space="preserve">0.918±0.002</w:t>
+            </w:r>
+          </w:p>
+        </w:tc>
+        <w:tc>
+          <w:tcPr>
+            <w:vAlign w:val="center"/>
+          </w:tcPr>
+          <w:p>
+            <w:pPr>
+              <w:pStyle w:val="Compact"/>
+              <w:suppressAutoHyphens/>
+              <w:jc w:val="center"/>
+            </w:pPr>
+            <w:r>
+              <w:rPr>
+                <w:sz w:val="18"/>
+                <w:szCs w:val="18"/>
+              </w:rPr>
+              <w:t xml:space="preserve">0.708</w:t>
+            </w:r>
+          </w:p>
+        </w:tc>
+        <w:tc>
+          <w:tcPr>
+            <w:vAlign w:val="center"/>
+          </w:tcPr>
+          <w:p>
+            <w:pPr>
+              <w:pStyle w:val="Compact"/>
+              <w:suppressAutoHyphens/>
+              <w:jc w:val="center"/>
+            </w:pPr>
+            <w:r>
+              <w:rPr>
+                <w:sz w:val="18"/>
+                <w:szCs w:val="18"/>
+              </w:rPr>
+              <w:t xml:space="preserve">0.325±0.004</w:t>
+            </w:r>
+          </w:p>
+        </w:tc>
+        <w:tc>
+          <w:tcPr>
+            <w:vAlign w:val="center"/>
+          </w:tcPr>
+          <w:p>
+            <w:pPr>
+              <w:pStyle w:val="Compact"/>
+              <w:suppressAutoHyphens/>
+              <w:jc w:val="center"/>
+            </w:pPr>
+            <w:r>
+              <w:rPr>
+                <w:sz w:val="18"/>
+                <w:szCs w:val="18"/>
+              </w:rPr>
+              <w:t xml:space="preserve">0.025</w:t>
             </w:r>
           </w:p>
         </w:tc>
@@ -9054,102 +9075,102 @@
                 <w:sz w:val="18"/>
                 <w:szCs w:val="18"/>
               </w:rPr>
-              <w:t xml:space="preserve">0.849</w:t>
-            </w:r>
-          </w:p>
-        </w:tc>
-        <w:tc>
-          <w:tcPr>
-            <w:vAlign w:val="center"/>
-          </w:tcPr>
-          <w:p>
-            <w:pPr>
-              <w:pStyle w:val="Compact"/>
-              <w:suppressAutoHyphens/>
-              <w:jc w:val="center"/>
-            </w:pPr>
-            <w:r>
-              <w:rPr>
-                <w:sz w:val="18"/>
-                <w:szCs w:val="18"/>
-              </w:rPr>
-              <w:t xml:space="preserve">0.706</w:t>
-            </w:r>
-          </w:p>
-        </w:tc>
-        <w:tc>
-          <w:tcPr>
-            <w:vAlign w:val="center"/>
-          </w:tcPr>
-          <w:p>
-            <w:pPr>
-              <w:pStyle w:val="Compact"/>
-              <w:suppressAutoHyphens/>
-              <w:jc w:val="center"/>
-            </w:pPr>
-            <w:r>
-              <w:rPr>
-                <w:sz w:val="18"/>
-                <w:szCs w:val="18"/>
-              </w:rPr>
-              <w:t xml:space="preserve">0.970</w:t>
-            </w:r>
-          </w:p>
-        </w:tc>
-        <w:tc>
-          <w:tcPr>
-            <w:vAlign w:val="center"/>
-          </w:tcPr>
-          <w:p>
-            <w:pPr>
-              <w:pStyle w:val="Compact"/>
-              <w:suppressAutoHyphens/>
-              <w:jc w:val="center"/>
-            </w:pPr>
-            <w:r>
-              <w:rPr>
-                <w:sz w:val="18"/>
-                <w:szCs w:val="18"/>
-              </w:rPr>
-              <w:t xml:space="preserve">0.841</w:t>
-            </w:r>
-          </w:p>
-        </w:tc>
-        <w:tc>
-          <w:tcPr>
-            <w:vAlign w:val="center"/>
-          </w:tcPr>
-          <w:p>
-            <w:pPr>
-              <w:pStyle w:val="Compact"/>
-              <w:suppressAutoHyphens/>
-              <w:jc w:val="center"/>
-            </w:pPr>
-            <w:r>
-              <w:rPr>
-                <w:sz w:val="18"/>
-                <w:szCs w:val="18"/>
-              </w:rPr>
-              <w:t xml:space="preserve">0.497</w:t>
-            </w:r>
-          </w:p>
-        </w:tc>
-        <w:tc>
-          <w:tcPr>
-            <w:vAlign w:val="center"/>
-          </w:tcPr>
-          <w:p>
-            <w:pPr>
-              <w:pStyle w:val="Compact"/>
-              <w:suppressAutoHyphens/>
-              <w:jc w:val="center"/>
-            </w:pPr>
-            <w:r>
-              <w:rPr>
-                <w:sz w:val="18"/>
-                <w:szCs w:val="18"/>
-              </w:rPr>
-              <w:t xml:space="preserve">0.023</w:t>
+              <w:t xml:space="preserve">0.843±0.005</w:t>
+            </w:r>
+          </w:p>
+        </w:tc>
+        <w:tc>
+          <w:tcPr>
+            <w:vAlign w:val="center"/>
+          </w:tcPr>
+          <w:p>
+            <w:pPr>
+              <w:pStyle w:val="Compact"/>
+              <w:suppressAutoHyphens/>
+              <w:jc w:val="center"/>
+            </w:pPr>
+            <w:r>
+              <w:rPr>
+                <w:sz w:val="18"/>
+                <w:szCs w:val="18"/>
+              </w:rPr>
+              <w:t xml:space="preserve">0.699</w:t>
+            </w:r>
+          </w:p>
+        </w:tc>
+        <w:tc>
+          <w:tcPr>
+            <w:vAlign w:val="center"/>
+          </w:tcPr>
+          <w:p>
+            <w:pPr>
+              <w:pStyle w:val="Compact"/>
+              <w:suppressAutoHyphens/>
+              <w:jc w:val="center"/>
+            </w:pPr>
+            <w:r>
+              <w:rPr>
+                <w:sz w:val="18"/>
+                <w:szCs w:val="18"/>
+              </w:rPr>
+              <w:t xml:space="preserve">0.969±0.001</w:t>
+            </w:r>
+          </w:p>
+        </w:tc>
+        <w:tc>
+          <w:tcPr>
+            <w:vAlign w:val="center"/>
+          </w:tcPr>
+          <w:p>
+            <w:pPr>
+              <w:pStyle w:val="Compact"/>
+              <w:suppressAutoHyphens/>
+              <w:jc w:val="center"/>
+            </w:pPr>
+            <w:r>
+              <w:rPr>
+                <w:sz w:val="18"/>
+                <w:szCs w:val="18"/>
+              </w:rPr>
+              <w:t xml:space="preserve">0.833</w:t>
+            </w:r>
+          </w:p>
+        </w:tc>
+        <w:tc>
+          <w:tcPr>
+            <w:vAlign w:val="center"/>
+          </w:tcPr>
+          <w:p>
+            <w:pPr>
+              <w:pStyle w:val="Compact"/>
+              <w:suppressAutoHyphens/>
+              <w:jc w:val="center"/>
+            </w:pPr>
+            <w:r>
+              <w:rPr>
+                <w:sz w:val="18"/>
+                <w:szCs w:val="18"/>
+              </w:rPr>
+              <w:t xml:space="preserve">0.477±0.018</w:t>
+            </w:r>
+          </w:p>
+        </w:tc>
+        <w:tc>
+          <w:tcPr>
+            <w:vAlign w:val="center"/>
+          </w:tcPr>
+          <w:p>
+            <w:pPr>
+              <w:pStyle w:val="Compact"/>
+              <w:suppressAutoHyphens/>
+              <w:jc w:val="center"/>
+            </w:pPr>
+            <w:r>
+              <w:rPr>
+                <w:sz w:val="18"/>
+                <w:szCs w:val="18"/>
+              </w:rPr>
+              <w:t xml:space="preserve">0.022</w:t>
             </w:r>
           </w:p>
         </w:tc>
@@ -9208,7 +9229,7 @@
                 <w:sz w:val="18"/>
                 <w:szCs w:val="18"/>
               </w:rPr>
-              <w:t xml:space="preserve">0.834</w:t>
+              <w:t xml:space="preserve">0.834±0.002</w:t>
             </w:r>
           </w:p>
         </w:tc>
@@ -9246,45 +9267,45 @@
                 <w:sz w:val="18"/>
                 <w:szCs w:val="18"/>
               </w:rPr>
-              <w:t xml:space="preserve">0.968</w:t>
-            </w:r>
-          </w:p>
-        </w:tc>
-        <w:tc>
-          <w:tcPr>
-            <w:vAlign w:val="center"/>
-          </w:tcPr>
-          <w:p>
-            <w:pPr>
-              <w:pStyle w:val="Compact"/>
-              <w:suppressAutoHyphens/>
-              <w:jc w:val="center"/>
-            </w:pPr>
-            <w:r>
-              <w:rPr>
-                <w:sz w:val="18"/>
-                <w:szCs w:val="18"/>
-              </w:rPr>
-              <w:t xml:space="preserve">0.825</w:t>
-            </w:r>
-          </w:p>
-        </w:tc>
-        <w:tc>
-          <w:tcPr>
-            <w:vAlign w:val="center"/>
-          </w:tcPr>
-          <w:p>
-            <w:pPr>
-              <w:pStyle w:val="Compact"/>
-              <w:suppressAutoHyphens/>
-              <w:jc w:val="center"/>
-            </w:pPr>
-            <w:r>
-              <w:rPr>
-                <w:sz w:val="18"/>
-                <w:szCs w:val="18"/>
-              </w:rPr>
-              <w:t xml:space="preserve">0.445</w:t>
+              <w:t xml:space="preserve">0.968±0.000</w:t>
+            </w:r>
+          </w:p>
+        </w:tc>
+        <w:tc>
+          <w:tcPr>
+            <w:vAlign w:val="center"/>
+          </w:tcPr>
+          <w:p>
+            <w:pPr>
+              <w:pStyle w:val="Compact"/>
+              <w:suppressAutoHyphens/>
+              <w:jc w:val="center"/>
+            </w:pPr>
+            <w:r>
+              <w:rPr>
+                <w:sz w:val="18"/>
+                <w:szCs w:val="18"/>
+              </w:rPr>
+              <w:t xml:space="preserve">0.824</w:t>
+            </w:r>
+          </w:p>
+        </w:tc>
+        <w:tc>
+          <w:tcPr>
+            <w:vAlign w:val="center"/>
+          </w:tcPr>
+          <w:p>
+            <w:pPr>
+              <w:pStyle w:val="Compact"/>
+              <w:suppressAutoHyphens/>
+              <w:jc w:val="center"/>
+            </w:pPr>
+            <w:r>
+              <w:rPr>
+                <w:sz w:val="18"/>
+                <w:szCs w:val="18"/>
+              </w:rPr>
+              <w:t xml:space="preserve">0.444±0.010</w:t>
             </w:r>
           </w:p>
         </w:tc>
@@ -10179,7 +10200,7 @@
                 <w:sz w:val="18"/>
                 <w:szCs w:val="18"/>
               </w:rPr>
-              <w:t xml:space="preserve">0.973</w:t>
+              <w:t xml:space="preserve">0.972±0.001</w:t>
             </w:r>
           </w:p>
         </w:tc>
@@ -10217,7 +10238,7 @@
                 <w:sz w:val="18"/>
                 <w:szCs w:val="18"/>
               </w:rPr>
-              <w:t xml:space="preserve">1.000</w:t>
+              <w:t xml:space="preserve">1.000±0.000</w:t>
             </w:r>
           </w:p>
         </w:tc>
@@ -10255,26 +10276,26 @@
                 <w:sz w:val="18"/>
                 <w:szCs w:val="18"/>
               </w:rPr>
-              <w:t xml:space="preserve">0.871</w:t>
-            </w:r>
-          </w:p>
-        </w:tc>
-        <w:tc>
-          <w:tcPr>
-            <w:vAlign w:val="center"/>
-          </w:tcPr>
-          <w:p>
-            <w:pPr>
-              <w:pStyle w:val="Compact"/>
-              <w:suppressAutoHyphens/>
-              <w:jc w:val="center"/>
-            </w:pPr>
-            <w:r>
-              <w:rPr>
-                <w:sz w:val="18"/>
-                <w:szCs w:val="18"/>
-              </w:rPr>
-              <w:t xml:space="preserve">0.730</w:t>
+              <w:t xml:space="preserve">0.867±0.005</w:t>
+            </w:r>
+          </w:p>
+        </w:tc>
+        <w:tc>
+          <w:tcPr>
+            <w:vAlign w:val="center"/>
+          </w:tcPr>
+          <w:p>
+            <w:pPr>
+              <w:pStyle w:val="Compact"/>
+              <w:suppressAutoHyphens/>
+              <w:jc w:val="center"/>
+            </w:pPr>
+            <w:r>
+              <w:rPr>
+                <w:sz w:val="18"/>
+                <w:szCs w:val="18"/>
+              </w:rPr>
+              <w:t xml:space="preserve">0.705</w:t>
             </w:r>
           </w:p>
         </w:tc>
@@ -10333,26 +10354,180 @@
                 <w:sz w:val="18"/>
                 <w:szCs w:val="18"/>
               </w:rPr>
-              <w:t xml:space="preserve">0.972</w:t>
-            </w:r>
-          </w:p>
-        </w:tc>
-        <w:tc>
-          <w:tcPr>
-            <w:vAlign w:val="center"/>
-          </w:tcPr>
-          <w:p>
-            <w:pPr>
-              <w:pStyle w:val="Compact"/>
-              <w:suppressAutoHyphens/>
-              <w:jc w:val="center"/>
-            </w:pPr>
-            <w:r>
-              <w:rPr>
-                <w:sz w:val="18"/>
-                <w:szCs w:val="18"/>
-              </w:rPr>
-              <w:t xml:space="preserve">0.948</w:t>
+              <w:t xml:space="preserve">0.972±0.000</w:t>
+            </w:r>
+          </w:p>
+        </w:tc>
+        <w:tc>
+          <w:tcPr>
+            <w:vAlign w:val="center"/>
+          </w:tcPr>
+          <w:p>
+            <w:pPr>
+              <w:pStyle w:val="Compact"/>
+              <w:suppressAutoHyphens/>
+              <w:jc w:val="center"/>
+            </w:pPr>
+            <w:r>
+              <w:rPr>
+                <w:sz w:val="18"/>
+                <w:szCs w:val="18"/>
+              </w:rPr>
+              <w:t xml:space="preserve">0.952</w:t>
+            </w:r>
+          </w:p>
+        </w:tc>
+        <w:tc>
+          <w:tcPr>
+            <w:vAlign w:val="center"/>
+          </w:tcPr>
+          <w:p>
+            <w:pPr>
+              <w:pStyle w:val="Compact"/>
+              <w:suppressAutoHyphens/>
+              <w:jc w:val="center"/>
+            </w:pPr>
+            <w:r>
+              <w:rPr>
+                <w:sz w:val="18"/>
+                <w:szCs w:val="18"/>
+              </w:rPr>
+              <w:t xml:space="preserve">1.000±0.000</w:t>
+            </w:r>
+          </w:p>
+        </w:tc>
+        <w:tc>
+          <w:tcPr>
+            <w:vAlign w:val="center"/>
+          </w:tcPr>
+          <w:p>
+            <w:pPr>
+              <w:pStyle w:val="Compact"/>
+              <w:suppressAutoHyphens/>
+              <w:jc w:val="center"/>
+            </w:pPr>
+            <w:r>
+              <w:rPr>
+                <w:sz w:val="18"/>
+                <w:szCs w:val="18"/>
+              </w:rPr>
+              <w:t xml:space="preserve">0.990</w:t>
+            </w:r>
+          </w:p>
+        </w:tc>
+        <w:tc>
+          <w:tcPr>
+            <w:vAlign w:val="center"/>
+          </w:tcPr>
+          <w:p>
+            <w:pPr>
+              <w:pStyle w:val="Compact"/>
+              <w:suppressAutoHyphens/>
+              <w:jc w:val="center"/>
+            </w:pPr>
+            <w:r>
+              <w:rPr>
+                <w:sz w:val="18"/>
+                <w:szCs w:val="18"/>
+              </w:rPr>
+              <w:t xml:space="preserve">0.867±0.001</w:t>
+            </w:r>
+          </w:p>
+        </w:tc>
+        <w:tc>
+          <w:tcPr>
+            <w:vAlign w:val="center"/>
+          </w:tcPr>
+          <w:p>
+            <w:pPr>
+              <w:pStyle w:val="Compact"/>
+              <w:suppressAutoHyphens/>
+              <w:jc w:val="center"/>
+            </w:pPr>
+            <w:r>
+              <w:rPr>
+                <w:sz w:val="18"/>
+                <w:szCs w:val="18"/>
+              </w:rPr>
+              <w:t xml:space="preserve">0.726</w:t>
+            </w:r>
+          </w:p>
+        </w:tc>
+      </w:tr>
+      <w:tr>
+        <w:tc>
+          <w:tcPr>
+            <w:vAlign w:val="center"/>
+          </w:tcPr>
+          <w:p>
+            <w:pPr>
+              <w:pStyle w:val="Compact"/>
+              <w:suppressAutoHyphens/>
+              <w:jc w:val="center"/>
+            </w:pPr>
+            <w:r>
+              <w:rPr>
+                <w:sz w:val="18"/>
+                <w:szCs w:val="18"/>
+              </w:rPr>
+              <w:t xml:space="preserve">GDN</w:t>
+            </w:r>
+          </w:p>
+        </w:tc>
+        <w:tc>
+          <w:tcPr>
+            <w:vAlign w:val="center"/>
+          </w:tcPr>
+          <w:p>
+            <w:pPr>
+              <w:pStyle w:val="Compact"/>
+              <w:suppressAutoHyphens/>
+              <w:jc w:val="center"/>
+            </w:pPr>
+            <w:r>
+              <w:rPr>
+                <w:sz w:val="18"/>
+                <w:szCs w:val="18"/>
+              </w:rPr>
+              <w:t xml:space="preserve">SOTA</w:t>
+            </w:r>
+          </w:p>
+        </w:tc>
+        <w:tc>
+          <w:tcPr>
+            <w:vAlign w:val="center"/>
+          </w:tcPr>
+          <w:p>
+            <w:pPr>
+              <w:pStyle w:val="Compact"/>
+              <w:suppressAutoHyphens/>
+              <w:jc w:val="center"/>
+            </w:pPr>
+            <w:r>
+              <w:rPr>
+                <w:sz w:val="18"/>
+                <w:szCs w:val="18"/>
+              </w:rPr>
+              <w:t xml:space="preserve">0.973</w:t>
+            </w:r>
+          </w:p>
+        </w:tc>
+        <w:tc>
+          <w:tcPr>
+            <w:vAlign w:val="center"/>
+          </w:tcPr>
+          <w:p>
+            <w:pPr>
+              <w:pStyle w:val="Compact"/>
+              <w:suppressAutoHyphens/>
+              <w:jc w:val="center"/>
+            </w:pPr>
+            <w:r>
+              <w:rPr>
+                <w:sz w:val="18"/>
+                <w:szCs w:val="18"/>
+              </w:rPr>
+              <w:t xml:space="preserve">0.946</w:t>
             </w:r>
           </w:p>
         </w:tc>
@@ -10409,26 +10584,26 @@
                 <w:sz w:val="18"/>
                 <w:szCs w:val="18"/>
               </w:rPr>
-              <w:t xml:space="preserve">0.867</w:t>
-            </w:r>
-          </w:p>
-        </w:tc>
-        <w:tc>
-          <w:tcPr>
-            <w:vAlign w:val="center"/>
-          </w:tcPr>
-          <w:p>
-            <w:pPr>
-              <w:pStyle w:val="Compact"/>
-              <w:suppressAutoHyphens/>
-              <w:jc w:val="center"/>
-            </w:pPr>
-            <w:r>
-              <w:rPr>
-                <w:sz w:val="18"/>
-                <w:szCs w:val="18"/>
-              </w:rPr>
-              <w:t xml:space="preserve">0.725</w:t>
+              <w:t xml:space="preserve">0.871</w:t>
+            </w:r>
+          </w:p>
+        </w:tc>
+        <w:tc>
+          <w:tcPr>
+            <w:vAlign w:val="center"/>
+          </w:tcPr>
+          <w:p>
+            <w:pPr>
+              <w:pStyle w:val="Compact"/>
+              <w:suppressAutoHyphens/>
+              <w:jc w:val="center"/>
+            </w:pPr>
+            <w:r>
+              <w:rPr>
+                <w:sz w:val="18"/>
+                <w:szCs w:val="18"/>
+              </w:rPr>
+              <w:t xml:space="preserve">0.698</w:t>
             </w:r>
           </w:p>
         </w:tc>
@@ -10655,13 +10830,13 @@
         <w:t xml:space="preserve"> </w:t>
       </w:r>
       <w:r>
-        <w:t xml:space="preserve">attack episodes), well above the AutoEncoder (0.757) and far above the deep detectors USAD (0.497) and TranAD</w:t>
-      </w:r>
-      <w:r>
-        <w:t xml:space="preserve"> </w:t>
-      </w:r>
-      <w:r>
-        <w:t xml:space="preserve">(0.445), which sit near chance. This margin over the AutoEncoder is statistically significant: an episode-block</w:t>
+        <w:t xml:space="preserve">attack episodes), well above the AutoEncoder (0.757) and far above the deep detectors USAD (0.477) and TranAD</w:t>
+      </w:r>
+      <w:r>
+        <w:t xml:space="preserve"> </w:t>
+      </w:r>
+      <w:r>
+        <w:t xml:space="preserve">(0.444), which sit near chance. This margin over the AutoEncoder is statistically significant: an episode-block</w:t>
       </w:r>
       <w:r>
         <w:t xml:space="preserve"> </w:t>
@@ -11796,19 +11971,19 @@
         <w:t xml:space="preserve"> </w:t>
       </w:r>
       <w:r>
-        <w:t xml:space="preserve">and TranAD collapse on the difficult subset of the two joint-structure benchmarks: they fall to 0.497 and 0.445</w:t>
-      </w:r>
-      <w:r>
-        <w:t xml:space="preserve"> </w:t>
-      </w:r>
-      <w:r>
-        <w:t xml:space="preserve">on HAI and to 0.303 and 0.333 on WADI, near or below chance and far below our 0.690–0.811, even while they</w:t>
-      </w:r>
-      <w:r>
-        <w:t xml:space="preserve"> </w:t>
-      </w:r>
-      <w:r>
-        <w:t xml:space="preserve">remain strong on Easy (0.90–0.97). This is the concrete face of the “illusion of success”:</w:t>
+        <w:t xml:space="preserve">and TranAD collapse on the difficult subset of the two joint-structure benchmarks: over five seeds they fall to</w:t>
+      </w:r>
+      <w:r>
+        <w:t xml:space="preserve"> </w:t>
+      </w:r>
+      <w:r>
+        <w:t xml:space="preserve">0.477 and 0.444 on HAI and to 0.305 and 0.325 on WADI, near or below chance and far below our 0.690–0.811,</w:t>
+      </w:r>
+      <w:r>
+        <w:t xml:space="preserve"> </w:t>
+      </w:r>
+      <w:r>
+        <w:t xml:space="preserve">even while they remain strong on Easy (0.90–0.97). This is the concrete face of the “illusion of success”:</w:t>
       </w:r>
       <w:r>
         <w:t xml:space="preserve"> </w:t>
@@ -11967,7 +12142,7 @@
         <w:t xml:space="preserve"> </w:t>
       </w:r>
       <w:r>
-        <w:t xml:space="preserve">(0.45–0.50); on WADI and SWaT it ties the strongest baseline at the top of the difficult column. Modelling normal as a jointly learned latent plus explicit mode clustering, and scoring by</w:t>
+        <w:t xml:space="preserve">(0.44–0.48); on WADI and SWaT it ties the strongest baseline at the top of the difficult column. Modelling normal as a jointly learned latent plus explicit mode clustering, and scoring by</w:t>
       </w:r>
       <w:r>
         <w:t xml:space="preserve"> </w:t>

</xml_diff>

<commit_message>
paper: frame A1-A10 as a design space; LatAD as one realization; alternative routes (density/regime) as future work
- Sec 1 contribution (2): 'a detector, one concrete realization of these assumptions'.
- Sec 4: new 'One realization of the assumptions' paragraph — assumptions fix WHAT to model
  not HOW; each design choice is a point in a larger space (regime separation via VaDE GMM vs
  correlation clustering; density via high-K mixture vs low-dim ensembles; A8 residual vs
  factorised group likelihoods); MIIM assumptions are the portable contribution.
- Sec 7: 'Alternative realizations of the assumptions' — correlation-community regime separation
  + per-group density ensembles (sparse-fault dilution) + sparsity-adaptive combination, as
  concrete next realizations. No exploratory numbers reported (registry only). DOCX rebuilt/QA'd.

Co-Authored-By: Claude Opus 4.8 <noreply@anthropic.com>
</commit_message>
<xml_diff>
--- a/paper_mdpi.docx
+++ b/paper_mdpi.docx
@@ -524,19 +524,19 @@
         <w:t xml:space="preserve"> </w:t>
       </w:r>
       <w:r>
-        <w:t xml:space="preserve">We build a detector whose whole design is faithfully modeling that normal law: a jointly</w:t>
-      </w:r>
-      <w:r>
-        <w:t xml:space="preserve"> </w:t>
-      </w:r>
-      <w:r>
-        <w:t xml:space="preserve">learned latent plus explicit Gaussian-mixture mode clustering (VaDE), scored in the latent by a mixture density</w:t>
-      </w:r>
-      <w:r>
-        <w:t xml:space="preserve"> </w:t>
-      </w:r>
-      <w:r>
-        <w:t xml:space="preserve">head and a rare-mode-safe nearest-component likelihood; a key mechanism is demoting reconstruction from the</w:t>
+        <w:t xml:space="preserve">We build a detector, one concrete realization of these assumptions, whose whole design is</w:t>
+      </w:r>
+      <w:r>
+        <w:t xml:space="preserve"> </w:t>
+      </w:r>
+      <w:r>
+        <w:t xml:space="preserve">faithfully modeling that normal law: a jointly learned latent plus explicit Gaussian-mixture mode clustering</w:t>
+      </w:r>
+      <w:r>
+        <w:t xml:space="preserve"> </w:t>
+      </w:r>
+      <w:r>
+        <w:t xml:space="preserve">(VaDE), scored in the latent by a mixture density head and a rare-mode-safe nearest-component likelihood; a key mechanism is demoting reconstruction from the</w:t>
       </w:r>
       <w:r>
         <w:t xml:space="preserve"> </w:t>
@@ -3090,6 +3090,146 @@
       </w:r>
       <w:r>
         <w:t xml:space="preserve">history-conditioned, path-dependent scoring (A10) is left to future work (§7).</w:t>
+      </w:r>
+    </w:p>
+    <w:p>
+      <w:pPr>
+        <w:pStyle w:val="MDPI31text"/>
+        <w:ind w:left="2608"/>
+      </w:pPr>
+      <w:r>
+        <w:rPr>
+          <w:b/>
+          <w:bCs/>
+        </w:rPr>
+        <w:t xml:space="preserve">One realization of the assumptions.</w:t>
+      </w:r>
+      <w:r>
+        <w:t xml:space="preserve"> </w:t>
+      </w:r>
+      <w:r>
+        <w:t xml:space="preserve">A1–A10 specify</w:t>
+      </w:r>
+      <w:r>
+        <w:t xml:space="preserve"> </w:t>
+      </w:r>
+      <w:r>
+        <w:rPr>
+          <w:i/>
+          <w:iCs/>
+        </w:rPr>
+        <w:t xml:space="preserve">what</w:t>
+      </w:r>
+      <w:r>
+        <w:t xml:space="preserve"> </w:t>
+      </w:r>
+      <w:r>
+        <w:t xml:space="preserve">a model of CPS normal</w:t>
+      </w:r>
+      <w:r>
+        <w:t xml:space="preserve"> </w:t>
+      </w:r>
+      <w:r>
+        <w:t xml:space="preserve">must capture — a massive, implicit, imbalanced multimodal law with thin fringes and rare regimes — not</w:t>
+      </w:r>
+      <w:r>
+        <w:t xml:space="preserve"> </w:t>
+      </w:r>
+      <w:r>
+        <w:rPr>
+          <w:i/>
+          <w:iCs/>
+        </w:rPr>
+        <w:t xml:space="preserve">how</w:t>
+      </w:r>
+      <w:r>
+        <w:t xml:space="preserve"> </w:t>
+      </w:r>
+      <w:r>
+        <w:t xml:space="preserve">to implement it. The detector described below is one concrete realization, reported in full so that</w:t>
+      </w:r>
+      <w:r>
+        <w:t xml:space="preserve"> </w:t>
+      </w:r>
+      <w:r>
+        <w:t xml:space="preserve">each of its choices is auditable; but each choice is a point in a larger design space that the same assumptions</w:t>
+      </w:r>
+      <w:r>
+        <w:t xml:space="preserve"> </w:t>
+      </w:r>
+      <w:r>
+        <w:t xml:space="preserve">admit. Regime separation (A1, A7) is realized here by a jointly learned VaDE Gaussian mixture, yet the assumptions</w:t>
+      </w:r>
+      <w:r>
+        <w:t xml:space="preserve"> </w:t>
+      </w:r>
+      <w:r>
+        <w:t xml:space="preserve">equally admit correlation-structure clustering or other unsupervised partitioners. Intra-mode density (A2, A4) is</w:t>
+      </w:r>
+      <w:r>
+        <w:t xml:space="preserve"> </w:t>
+      </w:r>
+      <w:r>
+        <w:t xml:space="preserve">realized here by a single high-</w:t>
+      </w:r>
+      <w:r>
+        <w:rPr>
+          <w:i/>
+          <w:iCs/>
+        </w:rPr>
+        <w:t xml:space="preserve">K</w:t>
+      </w:r>
+      <w:r>
+        <w:t xml:space="preserve"> </w:t>
+      </w:r>
+      <w:r>
+        <w:t xml:space="preserve">latent mixture, yet equally by non-parametric estimators or by ensembles</w:t>
+      </w:r>
+      <w:r>
+        <w:t xml:space="preserve"> </w:t>
+      </w:r>
+      <w:r>
+        <w:t xml:space="preserve">of lower-dimensional density models, which resist the dilution of a sparse joint fault in a high-dimensional</w:t>
+      </w:r>
+      <w:r>
+        <w:t xml:space="preserve"> </w:t>
+      </w:r>
+      <w:r>
+        <w:t xml:space="preserve">score. The cross-channel term (A8) is realized here by a whitened reconstruction residual, yet equally by explicit</w:t>
+      </w:r>
+      <w:r>
+        <w:t xml:space="preserve"> </w:t>
+      </w:r>
+      <w:r>
+        <w:t xml:space="preserve">factorised likelihoods over correlated channel groups. We therefore treat the MIIM assumptions, not any single</w:t>
+      </w:r>
+      <w:r>
+        <w:t xml:space="preserve"> </w:t>
+      </w:r>
+      <w:r>
+        <w:t xml:space="preserve">estimator, as the portable contribution: the model of §4 shows that the assumptions</w:t>
+      </w:r>
+      <w:r>
+        <w:t xml:space="preserve"> </w:t>
+      </w:r>
+      <w:r>
+        <w:rPr>
+          <w:i/>
+          <w:iCs/>
+        </w:rPr>
+        <w:t xml:space="preserve">can</w:t>
+      </w:r>
+      <w:r>
+        <w:t xml:space="preserve"> </w:t>
+      </w:r>
+      <w:r>
+        <w:t xml:space="preserve">be realized</w:t>
+      </w:r>
+      <w:r>
+        <w:t xml:space="preserve"> </w:t>
+      </w:r>
+      <w:r>
+        <w:t xml:space="preserve">and that doing so delivers the reported gains, and §7 returns to these alternative routes as future work.</w:t>
       </w:r>
     </w:p>
     <w:p>
@@ -13177,6 +13317,117 @@
       </w:r>
       <w:r>
         <w:t xml:space="preserve">fault.</w:t>
+      </w:r>
+    </w:p>
+    <w:p>
+      <w:pPr>
+        <w:pStyle w:val="MDPI31text"/>
+        <w:ind w:left="2608"/>
+      </w:pPr>
+      <w:r>
+        <w:rPr>
+          <w:b/>
+          <w:bCs/>
+        </w:rPr>
+        <w:t xml:space="preserve">Alternative realizations of the assumptions.</w:t>
+      </w:r>
+      <w:r>
+        <w:t xml:space="preserve"> </w:t>
+      </w:r>
+      <w:r>
+        <w:t xml:space="preserve">Because the MIIM assumptions fix the structure to</w:t>
+      </w:r>
+      <w:r>
+        <w:t xml:space="preserve"> </w:t>
+      </w:r>
+      <w:r>
+        <w:t xml:space="preserve">model rather than the estimator (§4), they open a family of detectors beyond the one reported here, and two</w:t>
+      </w:r>
+      <w:r>
+        <w:t xml:space="preserve"> </w:t>
+      </w:r>
+      <w:r>
+        <w:t xml:space="preserve">routes are especially promising. First,</w:t>
+      </w:r>
+      <w:r>
+        <w:t xml:space="preserve"> </w:t>
+      </w:r>
+      <w:r>
+        <w:rPr>
+          <w:i/>
+          <w:iCs/>
+        </w:rPr>
+        <w:t xml:space="preserve">regime separation</w:t>
+      </w:r>
+      <w:r>
+        <w:t xml:space="preserve"> </w:t>
+      </w:r>
+      <w:r>
+        <w:t xml:space="preserve">(A1, A7) need not come from a single global</w:t>
+      </w:r>
+      <w:r>
+        <w:t xml:space="preserve"> </w:t>
+      </w:r>
+      <w:r>
+        <w:t xml:space="preserve">latent mixture: correlation-structure clustering can recover the operating-mode groups directly, and a hierarchy</w:t>
+      </w:r>
+      <w:r>
+        <w:t xml:space="preserve"> </w:t>
+      </w:r>
+      <w:r>
+        <w:t xml:space="preserve">of such groups yields a multiscale decomposition of the normal law. Second, and relatedly,</w:t>
+      </w:r>
+      <w:r>
+        <w:t xml:space="preserve"> </w:t>
+      </w:r>
+      <w:r>
+        <w:rPr>
+          <w:i/>
+          <w:iCs/>
+        </w:rPr>
+        <w:t xml:space="preserve">density estimation</w:t>
+      </w:r>
+      <w:r>
+        <w:t xml:space="preserve"> </w:t>
+      </w:r>
+      <w:r>
+        <w:t xml:space="preserve">(A2, A4) need not be a single high-dimensional model: an ensemble of lower-dimensional density models, one per</w:t>
+      </w:r>
+      <w:r>
+        <w:t xml:space="preserve"> </w:t>
+      </w:r>
+      <w:r>
+        <w:t xml:space="preserve">correlated channel group, keeps a sparse joint fault from being diluted in a full-dimensional score, since a</w:t>
+      </w:r>
+      <w:r>
+        <w:t xml:space="preserve"> </w:t>
+      </w:r>
+      <w:r>
+        <w:t xml:space="preserve">fault confined to a few channels is a small fraction of the total dimensionality and is easily averaged away</w:t>
+      </w:r>
+      <w:r>
+        <w:t xml:space="preserve"> </w:t>
+      </w:r>
+      <w:r>
+        <w:t xml:space="preserve">globally. How to combine such per-group densities is itself an assumption-dependent choice — a summed</w:t>
+      </w:r>
+      <w:r>
+        <w:t xml:space="preserve"> </w:t>
+      </w:r>
+      <w:r>
+        <w:t xml:space="preserve">factorised likelihood is powerful when the fault is dense, a maximum over groups when it is sparse — and a</w:t>
+      </w:r>
+      <w:r>
+        <w:t xml:space="preserve"> </w:t>
+      </w:r>
+      <w:r>
+        <w:t xml:space="preserve">sparsity-adaptive combination is the principled reconciliation. We regard these as concrete next realizations of</w:t>
+      </w:r>
+      <w:r>
+        <w:t xml:space="preserve"> </w:t>
+      </w:r>
+      <w:r>
+        <w:t xml:space="preserve">the same assumption set rather than departures from it.</w:t>
       </w:r>
     </w:p>
     <w:p>

</xml_diff>

<commit_message>
paper: regime terminology (system regime = density mode), formalize multiscale regime-density decomposition, remove em-dashes
- 63 mode->regime replacements (word-boundary; multimodal/model preserved): operating regimes,
  between-regime, rare-regime, regime clustering/count/explosion, per-regime, regimes overlap.
- Sec 7: formal 'multiscale regime-density decomposition' with equations (group factorisation
  -log p = sum of per-group surprises; combination oplus in {sum,max,HC}; cohesion weight;
  single-model = degenerate all-channels group).
- Replaced 6 em-dashes with house-style punctuation (commas/colons/parentheses). DOCX rebuilt/QA.

Co-Authored-By: Claude Opus 4.8 <noreply@anthropic.com>
</commit_message>
<xml_diff>
--- a/paper_mdpi.docx
+++ b/paper_mdpi.docx
@@ -241,7 +241,7 @@
         <w:t xml:space="preserve"> </w:t>
       </w:r>
       <w:r>
-        <w:t xml:space="preserve">(MIIM). Based on these assumptions, we jointly learn a latent representation and a Gaussian-mixture clustering of operating modes. Anomaly scores are computed in the clustered latent space rather than from data-space reconstruction error. Aggregate scores are dominated by trivially detectable faults, so we evaluate under raw point-wise metrics with a difficulty split that isolates the stealthy, joint-structure faults a simple per-channel detector cannot see. Across three real CPS attack benchmarks (WADI, HAI, and SWaT), the detector attains the best overall AUROC on every dataset (0.792, 0.933, and 0.991). On the stealthy difficult subset it is strongest on HAI (0.811 over five seeds, a statistically significant margin over the next-best baseline, paired episode-bootstrap 95% CI on the difference [0.015, 0.089]), and it matches the strongest baseline on WADI (0.690) and SWaT (0.960); the HAI advantage persists under a stronger difficulty split that also removes any window separable by a single per-channel statistic. On a stricter double-hard subset that additionally removes windows a linear cross-channel predictor separates, the detector has the highest mean AUROC on all three datasets, with statistically supported superiority on HAI and numerical leads on the smaller WADI and single-episode SWaT subsets. On WADI and HAI, whose difficult faults are reconstructable but improbable sensor combinations that reconstruction error cannot separate from normal, the deep detectors USAD and TranAD collapse to 0.30–0.50. The contributions are the MIIM assumptions, the difficulty-stratified protocol, and a latent-primary anomaly score with an auto-gated reconstruction-residual head.</w:t>
+        <w:t xml:space="preserve">(MIIM). Based on these assumptions, we jointly learn a latent representation and a Gaussian-mixture clustering of operating regimes. Anomaly scores are computed in the clustered latent space rather than from data-space reconstruction error. Aggregate scores are dominated by trivially detectable faults, so we evaluate under raw point-wise metrics with a difficulty split that isolates the stealthy, joint-structure faults a simple per-channel detector cannot see. Across three real CPS attack benchmarks (WADI, HAI, and SWaT), the detector attains the best overall AUROC on every dataset (0.792, 0.933, and 0.991). On the stealthy difficult subset it is strongest on HAI (0.811 over five seeds, a statistically significant margin over the next-best baseline, paired episode-bootstrap 95% CI on the difference [0.015, 0.089]), and it matches the strongest baseline on WADI (0.690) and SWaT (0.960); the HAI advantage persists under a stronger difficulty split that also removes any window separable by a single per-channel statistic. On a stricter double-hard subset that additionally removes windows a linear cross-channel predictor separates, the detector has the highest mean AUROC on all three datasets, with statistically supported superiority on HAI and numerical leads on the smaller WADI and single-episode SWaT subsets. On WADI and HAI, whose difficult faults are reconstructable but improbable sensor combinations that reconstruction error cannot separate from normal, the deep detectors USAD and TranAD collapse to 0.30–0.50. The contributions are the MIIM assumptions, the difficulty-stratified protocol, and a latent-primary anomaly score with an auto-gated reconstruction-residual head.</w:t>
       </w:r>
     </w:p>
     <w:p>
@@ -278,7 +278,7 @@
         <w:ind w:left="2608"/>
       </w:pPr>
       <w:r>
-        <w:t xml:space="preserve">A modern cyber-physical system (CPS), whether a water-treatment plant, an industrial control loop, or a rotating machine, integrates hundreds of networked sensors, embedded controllers, and physical actuators, the sensing-and-actuation fabric of the industrial Internet of Things (IoT), into a single tightly coupled unit that continuously senses its own state and acts upon it. This complexity puts its faults beyond enumeration: the combinations of component, control mode, and operating condition in which a fault can arise cannot be predefined, tested, or exhaustively sampled before deployment, and many faults develop slowly, as wear, drift, or degradation that shows no obvious symptom until it is well advanced and can escalate into unplanned downtime or a safety-critical failure. Because the faults cannot be specified in advance, they must be discovered from the system’s own behaviour as it operates, which is the task of anomaly detection [</w:t>
+        <w:t xml:space="preserve">A modern cyber-physical system (CPS), whether a water-treatment plant, an industrial control loop, or a rotating machine, integrates hundreds of networked sensors, embedded controllers, and physical actuators, the sensing-and-actuation fabric of the industrial Internet of Things (IoT), into a single tightly coupled unit that continuously senses its own state and acts upon it. This complexity puts its faults beyond enumeration: the combinations of component, control regime, and operating condition in which a fault can arise cannot be predefined, tested, or exhaustively sampled before deployment, and many faults develop slowly, as wear, drift, or degradation that shows no obvious symptom until it is well advanced and can escalate into unplanned downtime or a safety-critical failure. Because the faults cannot be specified in advance, they must be discovered from the system’s own behaviour as it operates, which is the task of anomaly detection [</w:t>
       </w:r>
       <w:hyperlink w:anchor="r-chandola">
         <w:r>
@@ -334,7 +334,7 @@
         <w:t xml:space="preserve"> </w:t>
       </w:r>
       <w:r>
-        <w:t xml:space="preserve">the marginal envelope of every channel while breaking the joint structure: a correlation break, a between-mode pocket, a history-inconsistent state. These faults are invisible to any per-channel range rule, and, as we show, to a reconstruction residual as well.</w:t>
+        <w:t xml:space="preserve">the marginal envelope of every channel while breaking the joint structure: a correlation break, a between-regime pocket, a history-inconsistent state. These faults are invisible to any per-channel range rule, and, as we show, to a reconstruction residual as well.</w:t>
       </w:r>
     </w:p>
     <w:p>
@@ -419,13 +419,13 @@
         <w:t xml:space="preserve"> </w:t>
       </w:r>
       <w:r>
-        <w:t xml:space="preserve">union of many imbalanced modes, then a global anomaly model cannot represent it (a single blob under-fits the</w:t>
-      </w:r>
-      <w:r>
-        <w:t xml:space="preserve"> </w:t>
-      </w:r>
-      <w:r>
-        <w:t xml:space="preserve">regime structure), a single deep autoencoder alarms on rare-but-valid modes (the trust-eroding false positive),</w:t>
+        <w:t xml:space="preserve">union of many imbalanced regimes, then a global anomaly model cannot represent it (a single blob under-fits the</w:t>
+      </w:r>
+      <w:r>
+        <w:t xml:space="preserve"> </w:t>
+      </w:r>
+      <w:r>
+        <w:t xml:space="preserve">regime structure), a single deep autoencoder alarms on rare-but-valid regimes (the trust-eroding false positive),</w:t>
       </w:r>
       <w:r>
         <w:t xml:space="preserve"> </w:t>
@@ -530,13 +530,13 @@
         <w:t xml:space="preserve"> </w:t>
       </w:r>
       <w:r>
-        <w:t xml:space="preserve">faithfully modeling that normal law: a jointly learned latent plus explicit Gaussian-mixture mode clustering</w:t>
-      </w:r>
-      <w:r>
-        <w:t xml:space="preserve"> </w:t>
-      </w:r>
-      <w:r>
-        <w:t xml:space="preserve">(VaDE), scored in the latent by a mixture density head and a rare-mode-safe nearest-component likelihood; a key mechanism is demoting reconstruction from the</w:t>
+        <w:t xml:space="preserve">faithfully modeling that normal law: a jointly learned latent plus explicit Gaussian-mixture regime clustering</w:t>
+      </w:r>
+      <w:r>
+        <w:t xml:space="preserve"> </w:t>
+      </w:r>
+      <w:r>
+        <w:t xml:space="preserve">(VaDE), scored in the latent by a mixture density head and a rare-regime-safe nearest-component likelihood; a key mechanism is demoting reconstruction from the</w:t>
       </w:r>
       <w:r>
         <w:t xml:space="preserve"> </w:t>
@@ -1077,7 +1077,7 @@
         <w:t xml:space="preserve"> </w:t>
       </w:r>
       <w:r>
-        <w:t xml:space="preserve">regularisation but score against explicit per-mode Gaussians in a jointly learned latent rather than a</w:t>
+        <w:t xml:space="preserve">regularisation but score against explicit per-regime Gaussians in a jointly learned latent rather than a</w:t>
       </w:r>
       <w:r>
         <w:t xml:space="preserve"> </w:t>
@@ -1405,7 +1405,7 @@
         </w:r>
       </w:hyperlink>
       <w:r>
-        <w:t xml:space="preserve">] is a 59-channel hardware-in-the-loop industrial control testbed spanning several coupled processes. All three carry real executed attacks and are strongly multimodal (BIC-optimal mode counts</w:t>
+        <w:t xml:space="preserve">] is a 59-channel hardware-in-the-loop industrial control testbed spanning several coupled processes. All three carry real executed attacks and are strongly multimodal (BIC-optimal regime counts</w:t>
       </w:r>
       <w:r>
         <w:t xml:space="preserve"> </w:t>
@@ -1436,7 +1436,7 @@
         <w:ind w:left="2608"/>
       </w:pPr>
       <w:r>
-        <w:t xml:space="preserve">We model the normal law of a CPS as a mixture over reachable operating modes,</w:t>
+        <w:t xml:space="preserve">We model the normal law of a CPS as a mixture over reachable operating regimes,</w:t>
       </w:r>
       <w:r>
         <w:t xml:space="preserve"> </w:t>
@@ -1609,7 +1609,7 @@
         <w:t xml:space="preserve">M</w:t>
       </w:r>
       <w:r>
-        <w:t xml:space="preserve">assive, the mode structure is</w:t>
+        <w:t xml:space="preserve">assive, the regime structure is</w:t>
       </w:r>
       <w:r>
         <w:t xml:space="preserve"> </w:t>
@@ -1628,7 +1628,7 @@
         <w:t xml:space="preserve"> </w:t>
       </w:r>
       <w:r>
-        <w:t xml:space="preserve">(unlabelled and only approximately recoverable), the mode occupancy is</w:t>
+        <w:t xml:space="preserve">(unlabelled and only approximately recoverable), the regime occupancy is</w:t>
       </w:r>
       <w:r>
         <w:t xml:space="preserve"> </w:t>
@@ -1703,9 +1703,9 @@
       </w:tblPr>
       <w:tblGrid>
         <w:gridCol w:w="495"/>
-        <w:gridCol w:w="1811"/>
-        <w:gridCol w:w="3003"/>
-        <w:gridCol w:w="2549"/>
+        <w:gridCol w:w="1841"/>
+        <w:gridCol w:w="2986"/>
+        <w:gridCol w:w="2536"/>
       </w:tblGrid>
       <w:tr>
         <w:trPr>
@@ -1939,7 +1939,7 @@
                 <w:sz w:val="18"/>
                 <w:szCs w:val="18"/>
               </w:rPr>
-              <w:t xml:space="preserve">Mode explosion</w:t>
+              <w:t xml:space="preserve">Regime explosion</w:t>
             </w:r>
             <w:r>
               <w:rPr>
@@ -1953,26 +1953,26 @@
                 <w:sz w:val="18"/>
                 <w:szCs w:val="18"/>
               </w:rPr>
-              <w:t xml:space="preserve">(exponential mode growth)</w:t>
-            </w:r>
-          </w:p>
-        </w:tc>
-        <w:tc>
-          <w:tcPr>
-            <w:vAlign w:val="center"/>
-          </w:tcPr>
-          <w:p>
-            <w:pPr>
-              <w:pStyle w:val="Compact"/>
-              <w:suppressAutoHyphens/>
-              <w:jc w:val="center"/>
-            </w:pPr>
-            <w:r>
-              <w:rPr>
-                <w:sz w:val="18"/>
-                <w:szCs w:val="18"/>
-              </w:rPr>
-              <w:t xml:space="preserve">A CPS is built from many interacting subsystems; each added element multiplies reachable regimes, so mode count grows with complexity.</w:t>
+              <w:t xml:space="preserve">(exponential regime growth)</w:t>
+            </w:r>
+          </w:p>
+        </w:tc>
+        <w:tc>
+          <w:tcPr>
+            <w:vAlign w:val="center"/>
+          </w:tcPr>
+          <w:p>
+            <w:pPr>
+              <w:pStyle w:val="Compact"/>
+              <w:suppressAutoHyphens/>
+              <w:jc w:val="center"/>
+            </w:pPr>
+            <w:r>
+              <w:rPr>
+                <w:sz w:val="18"/>
+                <w:szCs w:val="18"/>
+              </w:rPr>
+              <w:t xml:space="preserve">A CPS is built from many interacting subsystems; each added element multiplies reachable regimes, so regime count grows with complexity.</w:t>
             </w:r>
           </w:p>
         </w:tc>
@@ -2102,7 +2102,7 @@
                 <w:sz w:val="18"/>
                 <w:szCs w:val="18"/>
               </w:rPr>
-              <w:t xml:space="preserve">(bounded modes; thin between-mode pockets)</w:t>
+              <w:t xml:space="preserve">(bounded regimes; thin between-regime pockets)</w:t>
             </w:r>
           </w:p>
         </w:tc>
@@ -2140,7 +2140,7 @@
                 <w:sz w:val="18"/>
                 <w:szCs w:val="18"/>
               </w:rPr>
-              <w:t xml:space="preserve">A between-mode point must score anomalous even when every channel is in range: the basin-agreement head (v).</w:t>
+              <w:t xml:space="preserve">A between-regime point must score anomalous even when every channel is in range: the basin-agreement head (v).</w:t>
             </w:r>
           </w:p>
         </w:tc>
@@ -2198,45 +2198,45 @@
                 <w:sz w:val="18"/>
                 <w:szCs w:val="18"/>
               </w:rPr>
-              <w:t xml:space="preserve">(intra-mode sparsity)</w:t>
-            </w:r>
-          </w:p>
-        </w:tc>
-        <w:tc>
-          <w:tcPr>
-            <w:vAlign w:val="center"/>
-          </w:tcPr>
-          <w:p>
-            <w:pPr>
-              <w:pStyle w:val="Compact"/>
-              <w:suppressAutoHyphens/>
-              <w:jc w:val="center"/>
-            </w:pPr>
-            <w:r>
-              <w:rPr>
-                <w:sz w:val="18"/>
-                <w:szCs w:val="18"/>
-              </w:rPr>
-              <w:t xml:space="preserve">Within a mode the system dwells near a typical operating point and reaches the edges only occasionally; each mode holds legitimate low-density regions near its boundary.</w:t>
-            </w:r>
-          </w:p>
-        </w:tc>
-        <w:tc>
-          <w:tcPr>
-            <w:vAlign w:val="center"/>
-          </w:tcPr>
-          <w:p>
-            <w:pPr>
-              <w:pStyle w:val="Compact"/>
-              <w:suppressAutoHyphens/>
-              <w:jc w:val="center"/>
-            </w:pPr>
-            <w:r>
-              <w:rPr>
-                <w:sz w:val="18"/>
-                <w:szCs w:val="18"/>
-              </w:rPr>
-              <w:t xml:space="preserve">Density inside a mode is non-Gaussian → a parametric high-</w:t>
+              <w:t xml:space="preserve">(intra-regime sparsity)</w:t>
+            </w:r>
+          </w:p>
+        </w:tc>
+        <w:tc>
+          <w:tcPr>
+            <w:vAlign w:val="center"/>
+          </w:tcPr>
+          <w:p>
+            <w:pPr>
+              <w:pStyle w:val="Compact"/>
+              <w:suppressAutoHyphens/>
+              <w:jc w:val="center"/>
+            </w:pPr>
+            <w:r>
+              <w:rPr>
+                <w:sz w:val="18"/>
+                <w:szCs w:val="18"/>
+              </w:rPr>
+              <w:t xml:space="preserve">Within a regime the system dwells near a typical operating point and reaches the edges only occasionally; each regime holds legitimate low-density regions near its boundary.</w:t>
+            </w:r>
+          </w:p>
+        </w:tc>
+        <w:tc>
+          <w:tcPr>
+            <w:vAlign w:val="center"/>
+          </w:tcPr>
+          <w:p>
+            <w:pPr>
+              <w:pStyle w:val="Compact"/>
+              <w:suppressAutoHyphens/>
+              <w:jc w:val="center"/>
+            </w:pPr>
+            <w:r>
+              <w:rPr>
+                <w:sz w:val="18"/>
+                <w:szCs w:val="18"/>
+              </w:rPr>
+              <w:t xml:space="preserve">Density inside a regime is non-Gaussian → a parametric high-</w:t>
             </w:r>
             <w:r>
               <w:rPr>
@@ -2259,7 +2259,7 @@
                 <w:sz w:val="18"/>
                 <w:szCs w:val="18"/>
               </w:rPr>
-              <w:t xml:space="preserve">mixture density head, not one Gaussian per mode.</w:t>
+              <w:t xml:space="preserve">mixture density head, not one Gaussian per regime.</w:t>
             </w:r>
           </w:p>
         </w:tc>
@@ -2481,7 +2481,7 @@
                 <w:sz w:val="18"/>
                 <w:szCs w:val="18"/>
               </w:rPr>
-              <w:t xml:space="preserve">component, never the π-weighted mixture, so a rare-but-valid mode is not penalised (iii).</w:t>
+              <w:t xml:space="preserve">component, never the π-weighted mixture, so a rare-but-valid regime is not penalised (iii).</w:t>
             </w:r>
           </w:p>
         </w:tc>
@@ -2539,45 +2539,45 @@
                 <w:sz w:val="18"/>
                 <w:szCs w:val="18"/>
               </w:rPr>
-              <w:t xml:space="preserve">(latent, implicit modes)</w:t>
-            </w:r>
-          </w:p>
-        </w:tc>
-        <w:tc>
-          <w:tcPr>
-            <w:vAlign w:val="center"/>
-          </w:tcPr>
-          <w:p>
-            <w:pPr>
-              <w:pStyle w:val="Compact"/>
-              <w:suppressAutoHyphens/>
-              <w:jc w:val="center"/>
-            </w:pPr>
-            <w:r>
-              <w:rPr>
-                <w:sz w:val="18"/>
-                <w:szCs w:val="18"/>
-              </w:rPr>
-              <w:t xml:space="preserve">True regimes are an emergent artifact of coupling and are not logged; modes must be discovered approximately from raw streams.</w:t>
-            </w:r>
-          </w:p>
-        </w:tc>
-        <w:tc>
-          <w:tcPr>
-            <w:vAlign w:val="center"/>
-          </w:tcPr>
-          <w:p>
-            <w:pPr>
-              <w:pStyle w:val="Compact"/>
-              <w:suppressAutoHyphens/>
-              <w:jc w:val="center"/>
-            </w:pPr>
-            <w:r>
-              <w:rPr>
-                <w:sz w:val="18"/>
-                <w:szCs w:val="18"/>
-              </w:rPr>
-              <w:t xml:space="preserve">Discover modes jointly with the representation (VaDE), unsupervised; never use mode labels.</w:t>
+              <w:t xml:space="preserve">(latent, implicit regimes)</w:t>
+            </w:r>
+          </w:p>
+        </w:tc>
+        <w:tc>
+          <w:tcPr>
+            <w:vAlign w:val="center"/>
+          </w:tcPr>
+          <w:p>
+            <w:pPr>
+              <w:pStyle w:val="Compact"/>
+              <w:suppressAutoHyphens/>
+              <w:jc w:val="center"/>
+            </w:pPr>
+            <w:r>
+              <w:rPr>
+                <w:sz w:val="18"/>
+                <w:szCs w:val="18"/>
+              </w:rPr>
+              <w:t xml:space="preserve">True regimes are an emergent artifact of coupling and are not logged; regimes must be discovered approximately from raw streams.</w:t>
+            </w:r>
+          </w:p>
+        </w:tc>
+        <w:tc>
+          <w:tcPr>
+            <w:vAlign w:val="center"/>
+          </w:tcPr>
+          <w:p>
+            <w:pPr>
+              <w:pStyle w:val="Compact"/>
+              <w:suppressAutoHyphens/>
+              <w:jc w:val="center"/>
+            </w:pPr>
+            <w:r>
+              <w:rPr>
+                <w:sz w:val="18"/>
+                <w:szCs w:val="18"/>
+              </w:rPr>
+              <w:t xml:space="preserve">Discover regimes jointly with the representation (VaDE), unsupervised; never use regime labels.</w:t>
             </w:r>
           </w:p>
         </w:tc>
@@ -2954,13 +2954,13 @@
         <w:t xml:space="preserve"> </w:t>
       </w:r>
       <w:r>
-        <w:t xml:space="preserve">Bayesian-information-criterion (BIC) mode counts keep improving past several dozen components on HAI and WADI,</w:t>
-      </w:r>
-      <w:r>
-        <w:t xml:space="preserve"> </w:t>
-      </w:r>
-      <w:r>
-        <w:t xml:space="preserve">yet the modes overlap (silhouette 0.08–0.19) rather than separating crisply. This is precisely the regime</w:t>
+        <w:t xml:space="preserve">Bayesian-information-criterion (BIC) regime counts keep improving past several dozen components on HAI and WADI,</w:t>
+      </w:r>
+      <w:r>
+        <w:t xml:space="preserve"> </w:t>
+      </w:r>
+      <w:r>
+        <w:t xml:space="preserve">yet the regimes overlap (silhouette 0.08–0.19) rather than separating crisply. This is precisely the regime</w:t>
       </w:r>
       <w:r>
         <w:t xml:space="preserve"> </w:t>
@@ -3065,7 +3065,7 @@
         <w:t xml:space="preserve"> </w:t>
       </w:r>
       <w:r>
-        <w:t xml:space="preserve">the basin where modes overlap), so an inapplicable head cannot backfire. This work therefore demonstrates a</w:t>
+        <w:t xml:space="preserve">the basin where regimes overlap), so an inapplicable head cannot backfire. This work therefore demonstrates a</w:t>
       </w:r>
       <w:r>
         <w:t xml:space="preserve"> </w:t>
@@ -3130,7 +3130,7 @@
         <w:t xml:space="preserve"> </w:t>
       </w:r>
       <w:r>
-        <w:t xml:space="preserve">must capture — a massive, implicit, imbalanced multimodal law with thin fringes and rare regimes — not</w:t>
+        <w:t xml:space="preserve">must capture (a massive, implicit, imbalanced multimodal law with thin fringes and rare regimes), not</w:t>
       </w:r>
       <w:r>
         <w:t xml:space="preserve"> </w:t>
@@ -3164,7 +3164,7 @@
         <w:t xml:space="preserve"> </w:t>
       </w:r>
       <w:r>
-        <w:t xml:space="preserve">equally admit correlation-structure clustering or other unsupervised partitioners. Intra-mode density (A2, A4) is</w:t>
+        <w:t xml:space="preserve">equally admit correlation-structure clustering or other unsupervised partitioners. Intra-regime density (A2, A4) is</w:t>
       </w:r>
       <w:r>
         <w:t xml:space="preserve"> </w:t>
@@ -3264,7 +3264,7 @@
         <w:t xml:space="preserve"> </w:t>
       </w:r>
       <w:r>
-        <w:t xml:space="preserve">representation and the operating-mode clusters are learned</w:t>
+        <w:t xml:space="preserve">representation and the operating-regime clusters are learned</w:t>
       </w:r>
       <w:r>
         <w:t xml:space="preserve"> </w:t>
@@ -4240,7 +4240,7 @@
         <w:t xml:space="preserve"> </w:t>
       </w:r>
       <w:r>
-        <w:t xml:space="preserve">faults (correlation breaks and between-mode pockets) this</w:t>
+        <w:t xml:space="preserve">faults (correlation breaks and between-regime pockets) this</w:t>
       </w:r>
       <w:r>
         <w:t xml:space="preserve"> </w:t>
@@ -4289,7 +4289,7 @@
         <w:t xml:space="preserve"> </w:t>
       </w:r>
       <w:r>
-        <w:t xml:space="preserve">signal but a single diagonal Gaussian per mode is coarse. A multi-seed, three-dataset head ablation is reported</w:t>
+        <w:t xml:space="preserve">signal but a single diagonal Gaussian per regime is coarse. A multi-seed, three-dataset head ablation is reported</w:t>
       </w:r>
       <w:r>
         <w:t xml:space="preserve"> </w:t>
@@ -4798,7 +4798,7 @@
         <w:ind w:left="2608"/>
       </w:pPr>
       <w:r>
-        <w:t xml:space="preserve">Because each mode has a non-uniform interior with thin fringes (A4), one Gaussian per mode is too coarse. We</w:t>
+        <w:t xml:space="preserve">Because each regime has a non-uniform interior with thin fringes (A4), one Gaussian per regime is too coarse. We</w:t>
       </w:r>
       <w:r>
         <w:t xml:space="preserve"> </w:t>
@@ -5033,7 +5033,7 @@
         <w:ind w:left="2608"/>
       </w:pPr>
       <w:r>
-        <w:t xml:space="preserve">(iii) Nearest-component NLL (rare-mode-safe)</w:t>
+        <w:t xml:space="preserve">(iii) Nearest-component NLL (rare-regime-safe)</w:t>
       </w:r>
     </w:p>
     <w:p>
@@ -5053,7 +5053,7 @@
         <w:t xml:space="preserve"> </w:t>
       </w:r>
       <w:r>
-        <w:t xml:space="preserve">mode must not be flagged</w:t>
+        <w:t xml:space="preserve">regime must not be flagged</w:t>
       </w:r>
       <w:r>
         <w:t xml:space="preserve"> </w:t>
@@ -5239,7 +5239,7 @@
         <w:ind w:left="2608"/>
       </w:pPr>
       <w:r>
-        <w:t xml:space="preserve">Using the maximum over components rather than the Bayesian mixture sum keeps a rare-mode signal that the</w:t>
+        <w:t xml:space="preserve">Using the maximum over components rather than the Bayesian mixture sum keeps a rare-regime signal that the</w:t>
       </w:r>
       <w:r>
         <w:t xml:space="preserve"> </w:t>
@@ -5251,7 +5251,7 @@
         <w:t xml:space="preserve"> </w:t>
       </w:r>
       <w:r>
-        <w:t xml:space="preserve">populated mode, whereas the mixture sum averages it away. The base</w:t>
+        <w:t xml:space="preserve">populated regime, whereas the mixture sum averages it away. The base</w:t>
       </w:r>
       <w:r>
         <w:t xml:space="preserve"> </w:t>
@@ -5444,7 +5444,7 @@
         </w:r>
       </w:hyperlink>
       <w:r>
-        <w:t xml:space="preserve">] precision per mode, and combines the per-mode whitened</w:t>
+        <w:t xml:space="preserve">] precision per regime, and combines the per-regime whitened</w:t>
       </w:r>
       <w:r>
         <w:t xml:space="preserve"> </w:t>
@@ -5633,7 +5633,7 @@
         <w:t xml:space="preserve"> </w:t>
       </w:r>
       <w:r>
-        <w:t xml:space="preserve">by a held-out-normal generalisation test: per-mode precisions are fitted on</w:t>
+        <w:t xml:space="preserve">by a held-out-normal generalisation test: per-regime precisions are fitted on</w:t>
       </w:r>
       <w:r>
         <w:t xml:space="preserve"> </w:t>
@@ -5746,7 +5746,7 @@
         <w:ind w:left="2608"/>
       </w:pPr>
       <w:r>
-        <w:t xml:space="preserve">Between-mode pockets (A3) are the dangerous false negative on datasets whose modes overlap. We perturb the</w:t>
+        <w:t xml:space="preserve">Between-regime pockets (A3) are the dangerous false negative on datasets whose regimes overlap. We perturb the</w:t>
       </w:r>
       <w:r>
         <w:t xml:space="preserve"> </w:t>
@@ -5779,13 +5779,13 @@
         <w:t xml:space="preserve">agreement</w:t>
       </w:r>
       <w:r>
-        <w:t xml:space="preserve">, the fraction of perturbed copies that keep the clean argmax mode. A</w:t>
-      </w:r>
-      <w:r>
-        <w:t xml:space="preserve"> </w:t>
-      </w:r>
-      <w:r>
-        <w:t xml:space="preserve">rare-but-valid point sits deep in one basin (high agreement, demote); a between-mode point flips modes under</w:t>
+        <w:t xml:space="preserve">, the fraction of perturbed copies that keep the clean argmax regime. A</w:t>
+      </w:r>
+      <w:r>
+        <w:t xml:space="preserve"> </w:t>
+      </w:r>
+      <w:r>
+        <w:t xml:space="preserve">rare-but-valid point sits deep in one basin (high agreement, demote); a between-regime point flips regimes under</w:t>
       </w:r>
       <w:r>
         <w:t xml:space="preserve"> </w:t>
@@ -6039,7 +6039,7 @@
         <w:t xml:space="preserve"> </w:t>
       </w:r>
       <w:r>
-        <w:t xml:space="preserve">a dead-zone. On crisp-mode</w:t>
+        <w:t xml:space="preserve">a dead-zone. On crisp-regime</w:t>
       </w:r>
       <w:r>
         <w:t xml:space="preserve"> </w:t>
@@ -6097,13 +6097,13 @@
         <w:t xml:space="preserve"> </w:t>
       </w:r>
       <w:r>
-        <w:t xml:space="preserve">a design provision for datasets with heavily overlapping modes; it stays inactive on all three benchmarks here and</w:t>
-      </w:r>
-      <w:r>
-        <w:t xml:space="preserve"> </w:t>
-      </w:r>
-      <w:r>
-        <w:t xml:space="preserve">is therefore not part of the empirical contribution, with its validation on overlapping-mode data left to future</w:t>
+        <w:t xml:space="preserve">a design provision for datasets with heavily overlapping regimes; it stays inactive on all three benchmarks here and</w:t>
+      </w:r>
+      <w:r>
+        <w:t xml:space="preserve"> </w:t>
+      </w:r>
+      <w:r>
+        <w:t xml:space="preserve">is therefore not part of the empirical contribution, with its validation on overlapping-regime data left to future</w:t>
       </w:r>
       <w:r>
         <w:t xml:space="preserve"> </w:t>
@@ -6146,7 +6146,7 @@
         <w:t xml:space="preserve"> </w:t>
       </w:r>
       <w:r>
-        <w:t xml:space="preserve">fires when train-normal modes overlap; it is a near no-op on all three datasets here. All calibration uses</w:t>
+        <w:t xml:space="preserve">fires when train-normal regimes overlap; it is a near no-op on all three datasets here. All calibration uses</w:t>
       </w:r>
       <w:r>
         <w:t xml:space="preserve"> </w:t>
@@ -12282,7 +12282,7 @@
         <w:t xml:space="preserve"> </w:t>
       </w:r>
       <w:r>
-        <w:t xml:space="preserve">(0.44–0.48); on WADI and SWaT it ties the strongest baseline at the top of the difficult column. Modelling normal as a jointly learned latent plus explicit mode clustering, and scoring by</w:t>
+        <w:t xml:space="preserve">(0.44–0.48); on WADI and SWaT it ties the strongest baseline at the top of the difficult column. Modelling normal as a jointly learned latent plus explicit regime clustering, and scoring by</w:t>
       </w:r>
       <w:r>
         <w:t xml:space="preserve"> </w:t>
@@ -12351,13 +12351,13 @@
         <w:t xml:space="preserve"> </w:t>
       </w:r>
       <w:r>
-        <w:t xml:space="preserve">decoder trained to reproduce several modes interpolates between them, so an improbable between-mode or</w:t>
-      </w:r>
-      <w:r>
-        <w:t xml:space="preserve"> </w:t>
-      </w:r>
-      <w:r>
-        <w:t xml:space="preserve">in-mode-tail combination sits inside the decoder's reachable range and reconstructs with low error. We verify this</w:t>
+        <w:t xml:space="preserve">decoder trained to reproduce several regimes interpolates between them, so an improbable between-regime or</w:t>
+      </w:r>
+      <w:r>
+        <w:t xml:space="preserve"> </w:t>
+      </w:r>
+      <w:r>
+        <w:t xml:space="preserve">in-regime-tail combination sits inside the decoder's reachable range and reconstructs with low error. We verify this</w:t>
       </w:r>
       <w:r>
         <w:t xml:space="preserve"> </w:t>
@@ -12381,7 +12381,7 @@
         <w:t xml:space="preserve"> </w:t>
       </w:r>
       <w:r>
-        <w:t xml:space="preserve">windows from different modes reconstruct even better than real normal (reconstruction AUROC 0.08), while the</w:t>
+        <w:t xml:space="preserve">windows from different regimes reconstruct even better than real normal (reconstruction AUROC 0.08), while the</w:t>
       </w:r>
       <w:r>
         <w:t xml:space="preserve"> </w:t>
@@ -12418,7 +12418,7 @@
         <w:t xml:space="preserve"> </w:t>
       </w:r>
       <w:r>
-        <w:t xml:space="preserve">rare-mode-safe nearest-component likelihood (A6); reconstruction is added back only through the optional,</w:t>
+        <w:t xml:space="preserve">rare-regime-safe nearest-component likelihood (A6); reconstruction is added back only through the optional,</w:t>
       </w:r>
       <w:r>
         <w:t xml:space="preserve"> </w:t>
@@ -13369,7 +13369,7 @@
         <w:t xml:space="preserve"> </w:t>
       </w:r>
       <w:r>
-        <w:t xml:space="preserve">latent mixture: correlation-structure clustering can recover the operating-mode groups directly, and a hierarchy</w:t>
+        <w:t xml:space="preserve">latent mixture: correlation-structure clustering can recover the operating-regime groups directly, and a hierarchy</w:t>
       </w:r>
       <w:r>
         <w:t xml:space="preserve"> </w:t>
@@ -13409,13 +13409,13 @@
         <w:t xml:space="preserve"> </w:t>
       </w:r>
       <w:r>
-        <w:t xml:space="preserve">globally. How to combine such per-group densities is itself an assumption-dependent choice — a summed</w:t>
-      </w:r>
-      <w:r>
-        <w:t xml:space="preserve"> </w:t>
-      </w:r>
-      <w:r>
-        <w:t xml:space="preserve">factorised likelihood is powerful when the fault is dense, a maximum over groups when it is sparse — and a</w:t>
+        <w:t xml:space="preserve">globally. How to combine such per-group densities is itself an assumption-dependent choice: a summed</w:t>
+      </w:r>
+      <w:r>
+        <w:t xml:space="preserve"> </w:t>
+      </w:r>
+      <w:r>
+        <w:t xml:space="preserve">factorised likelihood is powerful when the fault is dense, a maximum over groups when it is sparse, and a</w:t>
       </w:r>
       <w:r>
         <w:t xml:space="preserve"> </w:t>
@@ -13428,6 +13428,554 @@
       </w:r>
       <w:r>
         <w:t xml:space="preserve">the same assumption set rather than departures from it.</w:t>
+      </w:r>
+    </w:p>
+    <w:p>
+      <w:pPr>
+        <w:pStyle w:val="MDPI31text"/>
+        <w:ind w:left="2608"/>
+      </w:pPr>
+      <w:r>
+        <w:rPr>
+          <w:b/>
+          <w:bCs/>
+        </w:rPr>
+        <w:t xml:space="preserve">A multiscale regime-density decomposition.</w:t>
+      </w:r>
+      <w:r>
+        <w:t xml:space="preserve"> </w:t>
+      </w:r>
+      <w:r>
+        <w:t xml:space="preserve">The route above can be stated precisely. Let</w:t>
+      </w:r>
+      <w:r>
+        <w:t xml:space="preserve"> </w:t>
+      </w:r>
+      <m:oMath>
+        <m:r>
+          <m:rPr>
+            <m:scr m:val="script"/>
+            <m:sty m:val="p"/>
+          </m:rPr>
+          <m:t>C</m:t>
+        </m:r>
+      </m:oMath>
+      <w:r>
+        <w:t xml:space="preserve"> </w:t>
+      </w:r>
+      <w:r>
+        <w:t xml:space="preserve">be a set</w:t>
+      </w:r>
+      <w:r>
+        <w:t xml:space="preserve"> </w:t>
+      </w:r>
+      <w:r>
+        <w:t xml:space="preserve">of correlated channel groups (communities of the train-normal correlation graph, taken at one or several</w:t>
+      </w:r>
+      <w:r>
+        <w:t xml:space="preserve"> </w:t>
+      </w:r>
+      <w:r>
+        <w:t xml:space="preserve">scales of a regime hierarchy), and model each group's density</w:t>
+      </w:r>
+      <w:r>
+        <w:t xml:space="preserve"> </w:t>
+      </w:r>
+      <m:oMath>
+        <m:sSub>
+          <m:e>
+            <m:r>
+              <m:t>p</m:t>
+            </m:r>
+          </m:e>
+          <m:sub>
+            <m:r>
+              <m:t>G</m:t>
+            </m:r>
+          </m:sub>
+        </m:sSub>
+      </m:oMath>
+      <w:r>
+        <w:t xml:space="preserve"> </w:t>
+      </w:r>
+      <w:r>
+        <w:t xml:space="preserve">separately. Under a group factorisation the normal law and its surprise decompose as</w:t>
+      </w:r>
+    </w:p>
+    <w:p>
+      <w:pPr>
+        <w:pStyle w:val="MDPI39equation"/>
+        <w:ind w:left="2608"/>
+      </w:pPr>
+      <m:oMathPara>
+        <m:oMathParaPr>
+          <m:jc m:val="center"/>
+        </m:oMathParaPr>
+        <m:oMath>
+          <m:r>
+            <m:rPr>
+              <m:sty m:val="p"/>
+            </m:rPr>
+            <m:t>−</m:t>
+          </m:r>
+          <m:r>
+            <m:rPr>
+              <m:sty m:val="p"/>
+            </m:rPr>
+            <m:t>log</m:t>
+          </m:r>
+          <m:r>
+            <m:t> </m:t>
+          </m:r>
+          <m:r>
+            <m:t>p</m:t>
+          </m:r>
+          <m:r>
+            <m:rPr>
+              <m:sty m:val="p"/>
+            </m:rPr>
+            <m:t>(</m:t>
+          </m:r>
+          <m:r>
+            <m:t>x</m:t>
+          </m:r>
+          <m:r>
+            <m:rPr>
+              <m:sty m:val="p"/>
+            </m:rPr>
+            <m:t>)</m:t>
+          </m:r>
+          <m:r>
+            <m:rPr>
+              <m:sty m:val="p"/>
+            </m:rPr>
+            <m:t>≈</m:t>
+          </m:r>
+          <m:nary>
+            <m:naryPr>
+              <m:chr m:val="∑"/>
+              <m:limLoc m:val="undOvr"/>
+              <m:subHide m:val="off"/>
+              <m:supHide m:val="on"/>
+            </m:naryPr>
+            <m:sub>
+              <m:r>
+                <m:t>G</m:t>
+              </m:r>
+              <m:r>
+                <m:rPr>
+                  <m:sty m:val="p"/>
+                </m:rPr>
+                <m:t>∈</m:t>
+              </m:r>
+              <m:r>
+                <m:rPr>
+                  <m:scr m:val="script"/>
+                  <m:sty m:val="p"/>
+                </m:rPr>
+                <m:t>C</m:t>
+              </m:r>
+            </m:sub>
+            <m:sup>
+              <m:r>
+                <m:t>​</m:t>
+              </m:r>
+            </m:sup>
+            <m:e>
+              <m:sSub>
+                <m:e>
+                  <m:r>
+                    <m:t>s</m:t>
+                  </m:r>
+                </m:e>
+                <m:sub>
+                  <m:r>
+                    <m:t>G</m:t>
+                  </m:r>
+                </m:sub>
+              </m:sSub>
+            </m:e>
+          </m:nary>
+          <m:r>
+            <m:rPr>
+              <m:sty m:val="p"/>
+            </m:rPr>
+            <m:t>(</m:t>
+          </m:r>
+          <m:r>
+            <m:t>x</m:t>
+          </m:r>
+          <m:r>
+            <m:rPr>
+              <m:sty m:val="p"/>
+            </m:rPr>
+            <m:t>)</m:t>
+          </m:r>
+          <m:r>
+            <m:rPr>
+              <m:sty m:val="p"/>
+            </m:rPr>
+            <m:t>,</m:t>
+          </m:r>
+          <m:r>
+            <m:t> </m:t>
+          </m:r>
+          <m:sSub>
+            <m:e>
+              <m:r>
+                <m:t>s</m:t>
+              </m:r>
+            </m:e>
+            <m:sub>
+              <m:r>
+                <m:t>G</m:t>
+              </m:r>
+            </m:sub>
+          </m:sSub>
+          <m:r>
+            <m:rPr>
+              <m:sty m:val="p"/>
+            </m:rPr>
+            <m:t>(</m:t>
+          </m:r>
+          <m:r>
+            <m:t>x</m:t>
+          </m:r>
+          <m:r>
+            <m:rPr>
+              <m:sty m:val="p"/>
+            </m:rPr>
+            <m:t>)</m:t>
+          </m:r>
+          <m:r>
+            <m:rPr>
+              <m:sty m:val="p"/>
+            </m:rPr>
+            <m:t>=</m:t>
+          </m:r>
+          <m:r>
+            <m:rPr>
+              <m:sty m:val="p"/>
+            </m:rPr>
+            <m:t>−</m:t>
+          </m:r>
+          <m:r>
+            <m:rPr>
+              <m:sty m:val="p"/>
+            </m:rPr>
+            <m:t>log</m:t>
+          </m:r>
+          <m:r>
+            <m:t> </m:t>
+          </m:r>
+          <m:sSub>
+            <m:e>
+              <m:r>
+                <m:t>p</m:t>
+              </m:r>
+            </m:e>
+            <m:sub>
+              <m:r>
+                <m:t>G</m:t>
+              </m:r>
+            </m:sub>
+          </m:sSub>
+          <m:r>
+            <m:rPr>
+              <m:sty m:val="p"/>
+            </m:rPr>
+            <m:t>(</m:t>
+          </m:r>
+          <m:sSub>
+            <m:e>
+              <m:r>
+                <m:t>x</m:t>
+              </m:r>
+            </m:e>
+            <m:sub>
+              <m:r>
+                <m:t>G</m:t>
+              </m:r>
+            </m:sub>
+          </m:sSub>
+          <m:r>
+            <m:rPr>
+              <m:sty m:val="p"/>
+            </m:rPr>
+            <m:t>)</m:t>
+          </m:r>
+          <m:r>
+            <m:rPr>
+              <m:sty m:val="p"/>
+            </m:rPr>
+            <m:t>.</m:t>
+          </m:r>
+        </m:oMath>
+      </m:oMathPara>
+    </w:p>
+    <w:p>
+      <w:pPr>
+        <w:pStyle w:val="MDPI32textnoindent"/>
+        <w:ind w:left="2608"/>
+      </w:pPr>
+      <w:r>
+        <w:t xml:space="preserve">A detector scores a window by a combination of the per-group surprises,</w:t>
+      </w:r>
+      <w:r>
+        <w:t xml:space="preserve"> </w:t>
+      </w:r>
+      <m:oMath>
+        <m:r>
+          <m:t>s</m:t>
+        </m:r>
+        <m:r>
+          <m:rPr>
+            <m:sty m:val="p"/>
+          </m:rPr>
+          <m:t>(</m:t>
+        </m:r>
+        <m:r>
+          <m:t>x</m:t>
+        </m:r>
+        <m:r>
+          <m:rPr>
+            <m:sty m:val="p"/>
+          </m:rPr>
+          <m:t>)</m:t>
+        </m:r>
+        <m:r>
+          <m:rPr>
+            <m:sty m:val="p"/>
+          </m:rPr>
+          <m:t>=</m:t>
+        </m:r>
+        <m:sSub>
+          <m:e>
+            <m:r>
+              <m:rPr>
+                <m:sty m:val="p"/>
+              </m:rPr>
+              <m:t>⊕</m:t>
+            </m:r>
+          </m:e>
+          <m:sub>
+            <m:r>
+              <m:t>G</m:t>
+            </m:r>
+            <m:r>
+              <m:rPr>
+                <m:sty m:val="p"/>
+              </m:rPr>
+              <m:t>∈</m:t>
+            </m:r>
+            <m:r>
+              <m:rPr>
+                <m:scr m:val="script"/>
+                <m:sty m:val="p"/>
+              </m:rPr>
+              <m:t>C</m:t>
+            </m:r>
+          </m:sub>
+        </m:sSub>
+        <m:sSub>
+          <m:e>
+            <m:r>
+              <m:t>w</m:t>
+            </m:r>
+          </m:e>
+          <m:sub>
+            <m:r>
+              <m:t>G</m:t>
+            </m:r>
+          </m:sub>
+        </m:sSub>
+        <m:r>
+          <m:t> </m:t>
+        </m:r>
+        <m:sSub>
+          <m:e>
+            <m:r>
+              <m:t>s</m:t>
+            </m:r>
+          </m:e>
+          <m:sub>
+            <m:r>
+              <m:t>G</m:t>
+            </m:r>
+          </m:sub>
+        </m:sSub>
+        <m:r>
+          <m:rPr>
+            <m:sty m:val="p"/>
+          </m:rPr>
+          <m:t>(</m:t>
+        </m:r>
+        <m:r>
+          <m:t>x</m:t>
+        </m:r>
+        <m:r>
+          <m:rPr>
+            <m:sty m:val="p"/>
+          </m:rPr>
+          <m:t>)</m:t>
+        </m:r>
+      </m:oMath>
+      <w:r>
+        <w:t xml:space="preserve">,</w:t>
+      </w:r>
+      <w:r>
+        <w:t xml:space="preserve"> </w:t>
+      </w:r>
+      <w:r>
+        <w:t xml:space="preserve">where the group weight</w:t>
+      </w:r>
+      <w:r>
+        <w:t xml:space="preserve"> </w:t>
+      </w:r>
+      <m:oMath>
+        <m:sSub>
+          <m:e>
+            <m:r>
+              <m:t>w</m:t>
+            </m:r>
+          </m:e>
+          <m:sub>
+            <m:r>
+              <m:t>G</m:t>
+            </m:r>
+          </m:sub>
+        </m:sSub>
+      </m:oMath>
+      <w:r>
+        <w:t xml:space="preserve"> </w:t>
+      </w:r>
+      <w:r>
+        <w:t xml:space="preserve">rises with the group's internal correlation (a density violation inside a tightly coupled regime is more diagnostic).</w:t>
+      </w:r>
+      <w:r>
+        <w:t xml:space="preserve"> </w:t>
+      </w:r>
+      <w:r>
+        <w:t xml:space="preserve">The combination</w:t>
+      </w:r>
+      <w:r>
+        <w:t xml:space="preserve"> </w:t>
+      </w:r>
+      <m:oMath>
+        <m:r>
+          <m:rPr>
+            <m:sty m:val="p"/>
+          </m:rPr>
+          <m:t>⊕</m:t>
+        </m:r>
+      </m:oMath>
+      <w:r>
+        <w:t xml:space="preserve"> </w:t>
+      </w:r>
+      <w:r>
+        <w:t xml:space="preserve">encodes the</w:t>
+      </w:r>
+      <w:r>
+        <w:t xml:space="preserve"> </w:t>
+      </w:r>
+      <w:r>
+        <w:t xml:space="preserve">fault's expected extent: summation (</w:t>
+      </w:r>
+      <m:oMath>
+        <m:r>
+          <m:rPr>
+            <m:sty m:val="p"/>
+          </m:rPr>
+          <m:t>∑</m:t>
+        </m:r>
+      </m:oMath>
+      <w:r>
+        <w:t xml:space="preserve">)</w:t>
+      </w:r>
+      <w:r>
+        <w:t xml:space="preserve"> </w:t>
+      </w:r>
+      <w:r>
+        <w:t xml:space="preserve">is the factorised joint likelihood, optimal when a fault perturbs many groups; a maximum</w:t>
+      </w:r>
+      <w:r>
+        <w:t xml:space="preserve"> </w:t>
+      </w:r>
+      <w:r>
+        <w:t xml:space="preserve">(</w:t>
+      </w:r>
+      <m:oMath>
+        <m:r>
+          <m:rPr>
+            <m:sty m:val="p"/>
+          </m:rPr>
+          <m:t>max</m:t>
+        </m:r>
+      </m:oMath>
+      <w:r>
+        <w:t xml:space="preserve">) is a union bound over groups,</w:t>
+      </w:r>
+      <w:r>
+        <w:t xml:space="preserve"> </w:t>
+      </w:r>
+      <w:r>
+        <w:t xml:space="preserve">optimal when the fault is confined to one; and a sparsity-adaptive statistic (for instance Higher Criticism over</w:t>
+      </w:r>
+      <w:r>
+        <w:t xml:space="preserve"> </w:t>
+      </w:r>
+      <w:r>
+        <w:t xml:space="preserve">the per-group tail probabilities) interpolates between them without assuming the extent in advance. The</w:t>
+      </w:r>
+      <w:r>
+        <w:t xml:space="preserve"> </w:t>
+      </w:r>
+      <w:r>
+        <w:t xml:space="preserve">single-model detector of §4 is the degenerate case</w:t>
+      </w:r>
+      <w:r>
+        <w:t xml:space="preserve"> </w:t>
+      </w:r>
+      <m:oMath>
+        <m:r>
+          <m:rPr>
+            <m:scr m:val="script"/>
+            <m:sty m:val="p"/>
+          </m:rPr>
+          <m:t>C</m:t>
+        </m:r>
+        <m:r>
+          <m:rPr>
+            <m:sty m:val="p"/>
+          </m:rPr>
+          <m:t>=</m:t>
+        </m:r>
+        <m:d>
+          <m:dPr>
+            <m:begChr m:val="{"/>
+            <m:sepChr m:val=""/>
+            <m:endChr m:val="}"/>
+            <m:grow/>
+          </m:dPr>
+          <m:e>
+            <m:r>
+              <m:rPr>
+                <m:nor/>
+                <m:sty m:val="p"/>
+              </m:rPr>
+              <m:t>all channels</m:t>
+            </m:r>
+          </m:e>
+        </m:d>
+      </m:oMath>
+      <w:r>
+        <w:t xml:space="preserve">,</w:t>
+      </w:r>
+      <w:r>
+        <w:t xml:space="preserve"> </w:t>
+      </w:r>
+      <w:r>
+        <w:t xml:space="preserve">and it can itself be included as one group so a dense, whole-system fault is never missed.</w:t>
       </w:r>
     </w:p>
     <w:p>
@@ -13512,7 +14060,7 @@
         <w:t xml:space="preserve"> </w:t>
       </w:r>
       <w:r>
-        <w:t xml:space="preserve">latent plus explicit mode clustering, scored in the latent by a mixture density and a rare-mode-safe</w:t>
+        <w:t xml:space="preserve">latent plus explicit regime clustering, scored in the latent by a mixture density and a rare-regime-safe</w:t>
       </w:r>
       <w:r>
         <w:t xml:space="preserve"> </w:t>
@@ -13578,7 +14126,7 @@
         <w:t xml:space="preserve"> </w:t>
       </w:r>
       <w:r>
-        <w:t xml:space="preserve">as a single blob or a reconstruction target is a modelling failure, and jointly learning the latent and its modes,</w:t>
+        <w:t xml:space="preserve">as a single blob or a reconstruction target is a modelling failure, and jointly learning the latent and its regimes,</w:t>
       </w:r>
       <w:r>
         <w:t xml:space="preserve"> </w:t>

</xml_diff>